<commit_message>
Revise manuscript after internal review: IID control, budget runs, client-only baseline
</commit_message>
<xml_diff>
--- a/paper/docx/manuscript_long.docx
+++ b/paper/docx/manuscript_long.docx
@@ -88,7 +88,7 @@
           <w:sz w:val="19"/>
           <w:szCs w:val="19"/>
         </w:rPr>
-        <w:t xml:space="preserve"> Department of Internet of Things, School of Computer Science and Engineering, Vellore Institute of Technology, Vellore 632014, Tamil Nadu, India</w:t>
+        <w:t xml:space="preserve"> School of Computer Science and Engineering, Vellore Institute of Technology, Vellore 632014, Tamil Nadu, India</w:t>
       </w:r>
     </w:p>
     <w:p>
@@ -103,7 +103,7 @@
           <w:sz w:val="19"/>
           <w:szCs w:val="19"/>
         </w:rPr>
-        <w:t>* Corresponding author: pushkal.gupta2023@vitstudent.ac.in (alternate: pushkalgupta2005@gmail.com)</w:t>
+        <w:t>* Corresponding author: pushkal.gupta2023@vitstudent.ac.in</w:t>
       </w:r>
     </w:p>
     <w:p>
@@ -161,7 +161,7 @@
           <w:sz w:val="22"/>
           <w:szCs w:val="22"/>
         </w:rPr>
-        <w:t xml:space="preserve">Federated learning (FL) is widely proposed for household load forecasting because smart-meter readings never leave the home. Its accuracy loss is usually blamed on differences between households, and its bandwidth advantage over collecting the data is usually assumed rather than measured. This study separated these effects under controlled conditions. One hundred standard-tariff London households from the Low Carbon London trial, one chronological test period, one long short-term memory (LSTM) forecaster and one training budget were held fixed, and a single factor was changed at a time: the number of clients the homes were split over, the heterogeneity between clients (dialled over real load-profile clusters and measured directly), client participation, the aggregation rule and the precision of the transmitted updates. Every byte exchanged was counted, and households were compared pairwise. Federated training on a single client matched centralised accuracy (mean absolute error 0.0808 against 0.0811 kWh). The gap grew with fragmentation, from 2.0 % with five clients to 10.3 % with one client per home. Heterogeneity at a fixed number of clients changed final error by at most 0.0012 kWh but raised the traffic needed to approach centralised accuracy by about 85 %, and federated training moved more bytes than uploading the raw readings. Plain federated averaging left 66 % of households worse off than local models; one epoch of local fine-tuning reduced this to 48 %. Operators and aggregators should therefore federate a few aggregated clients, fine-tune locally and treat federation as a governance choice rather than a bandwidth saving.</w:t>
+        <w:t xml:space="preserve">Federated learning (FL) is widely proposed for household load forecasting because smart-meter readings never leave the home. Its accuracy loss is usually blamed on differences between households, and its bandwidth advantage over collecting the data is usually assumed rather than measured. This study separated these effects under controlled conditions. One hundred standard-tariff London households from the Low Carbon London trial, one chronological test period, one long short-term memory (LSTM) forecaster and one training budget were held fixed, and a single factor was changed at a time: the number of clients the homes were split over, the heterogeneity between clients (dialled over real load-profile clusters and measured directly), client participation, the aggregation rule and the precision of the transmitted updates. Every byte exchanged was counted, and households were compared pairwise. Federated training on a single client matched centralised accuracy (mean absolute error 0.0808 against 0.0811 kWh). The gap grew with fragmentation, from 2.0 % with five clients to 10.3 % with one client per home. Heterogeneity at a fixed number of clients changed final error by at most 0.0012 kWh but raised the traffic needed to approach centralised accuracy by about 85 %, and federated training moved more bytes than uploading the raw readings. Plain federated averaging left 66 % of households worse off than local models; one epoch of local fine-tuning reduced this to 49 %. Operators and aggregators should therefore federate a few aggregated clients, fine-tune locally and treat federation as a governance choice rather than a bandwidth saving.</w:t>
       </w:r>
     </w:p>
     <w:p>
@@ -574,6 +574,7 @@
     <w:p>
       <w:pPr>
         <w:keepNext/>
+        <w:keepLines/>
         <w:spacing w:before="80" w:after="160"/>
         <w:jc w:val="both"/>
       </w:pPr>
@@ -2769,6 +2770,7 @@
     </w:p>
     <w:p>
       <w:pPr>
+        <w:keepLines/>
         <w:spacing w:before="80" w:after="160"/>
         <w:jc w:val="both"/>
       </w:pPr>
@@ -6704,6 +6706,7 @@
     <w:p>
       <w:pPr>
         <w:keepNext/>
+        <w:keepLines/>
         <w:spacing w:before="80" w:after="160"/>
         <w:jc w:val="both"/>
       </w:pPr>
@@ -8377,6 +8380,7 @@
     <w:p>
       <w:pPr>
         <w:keepNext/>
+        <w:keepLines/>
         <w:spacing w:before="80" w:after="160"/>
         <w:jc w:val="both"/>
       </w:pPr>
@@ -8876,7 +8880,7 @@
                 <w:sz w:val="16"/>
                 <w:szCs w:val="16"/>
               </w:rPr>
-              <w:t xml:space="preserve">Seasonal naive (t–48)</w:t>
+              <w:t xml:space="preserve">Seasonal naive (t-−48)</w:t>
             </w:r>
           </w:p>
         </w:tc>
@@ -9525,7 +9529,7 @@
                 <w:sz w:val="16"/>
                 <w:szCs w:val="16"/>
               </w:rPr>
-              <w:t xml:space="preserve">0.0853 </w:t>
+              <w:t xml:space="preserve">0.0854 </w:t>
             </w:r>
             <w:r>
               <w:rPr>
@@ -9539,7 +9543,7 @@
                 <w:sz w:val="16"/>
                 <w:szCs w:val="16"/>
               </w:rPr>
-              <w:t xml:space="preserve"> 0.0009</w:t>
+              <w:t xml:space="preserve"> 0.0008</w:t>
             </w:r>
           </w:p>
         </w:tc>
@@ -9578,7 +9582,7 @@
                 <w:sz w:val="16"/>
                 <w:szCs w:val="16"/>
               </w:rPr>
-              <w:t xml:space="preserve"> 0.0007</w:t>
+              <w:t xml:space="preserve"> 0.0006</w:t>
             </w:r>
           </w:p>
         </w:tc>
@@ -9667,7 +9671,7 @@
                 <w:sz w:val="16"/>
                 <w:szCs w:val="16"/>
               </w:rPr>
-              <w:t xml:space="preserve">23.0 / 30</w:t>
+              <w:t xml:space="preserve">22.0 / 30</w:t>
             </w:r>
           </w:p>
         </w:tc>
@@ -9763,7 +9767,7 @@
                 <w:sz w:val="16"/>
                 <w:szCs w:val="16"/>
               </w:rPr>
-              <w:t xml:space="preserve">0.0861 </w:t>
+              <w:t xml:space="preserve">0.0860 </w:t>
             </w:r>
             <w:r>
               <w:rPr>
@@ -9777,7 +9781,7 @@
                 <w:sz w:val="16"/>
                 <w:szCs w:val="16"/>
               </w:rPr>
-              <w:t xml:space="preserve"> 0.0004</w:t>
+              <w:t xml:space="preserve"> 0.0003</w:t>
             </w:r>
           </w:p>
         </w:tc>
@@ -9802,7 +9806,7 @@
                 <w:sz w:val="16"/>
                 <w:szCs w:val="16"/>
               </w:rPr>
-              <w:t xml:space="preserve">0.1758 </w:t>
+              <w:t xml:space="preserve">0.1757 </w:t>
             </w:r>
             <w:r>
               <w:rPr>
@@ -9816,7 +9820,7 @@
                 <w:sz w:val="16"/>
                 <w:szCs w:val="16"/>
               </w:rPr>
-              <w:t xml:space="preserve"> 0.0007</w:t>
+              <w:t xml:space="preserve"> 0.0005</w:t>
             </w:r>
           </w:p>
         </w:tc>
@@ -9855,7 +9859,7 @@
                 <w:sz w:val="16"/>
                 <w:szCs w:val="16"/>
               </w:rPr>
-              <w:t xml:space="preserve"> 0.1</w:t>
+              <w:t xml:space="preserve"> 0.2</w:t>
             </w:r>
           </w:p>
         </w:tc>
@@ -10500,7 +10504,7 @@
                 <w:sz w:val="16"/>
                 <w:szCs w:val="16"/>
               </w:rPr>
-              <w:t xml:space="preserve">0.1758 </w:t>
+              <w:t xml:space="preserve">0.1759 </w:t>
             </w:r>
             <w:r>
               <w:rPr>
@@ -10514,7 +10518,7 @@
                 <w:sz w:val="16"/>
                 <w:szCs w:val="16"/>
               </w:rPr>
-              <w:t xml:space="preserve"> 0.0005</w:t>
+              <w:t xml:space="preserve"> 0.0004</w:t>
             </w:r>
           </w:p>
         </w:tc>
@@ -10603,7 +10607,7 @@
                 <w:sz w:val="16"/>
                 <w:szCs w:val="16"/>
               </w:rPr>
-              <w:t xml:space="preserve">22.0 / 30</w:t>
+              <w:t xml:space="preserve">21.4 / 30</w:t>
             </w:r>
           </w:p>
         </w:tc>
@@ -11143,7 +11147,7 @@
                 <w:sz w:val="16"/>
                 <w:szCs w:val="16"/>
               </w:rPr>
-              <w:t xml:space="preserve">0.0849 </w:t>
+              <w:t xml:space="preserve">0.0850 </w:t>
             </w:r>
             <w:r>
               <w:rPr>
@@ -11157,7 +11161,7 @@
                 <w:sz w:val="16"/>
                 <w:szCs w:val="16"/>
               </w:rPr>
-              <w:t xml:space="preserve"> 0.0004</w:t>
+              <w:t xml:space="preserve"> 0.0005</w:t>
             </w:r>
           </w:p>
         </w:tc>
@@ -11182,7 +11186,7 @@
                 <w:sz w:val="16"/>
                 <w:szCs w:val="16"/>
               </w:rPr>
-              <w:t xml:space="preserve">0.1757 </w:t>
+              <w:t xml:space="preserve">0.1759 </w:t>
             </w:r>
             <w:r>
               <w:rPr>
@@ -11196,7 +11200,7 @@
                 <w:sz w:val="16"/>
                 <w:szCs w:val="16"/>
               </w:rPr>
-              <w:t xml:space="preserve"> 0.0010</w:t>
+              <w:t xml:space="preserve"> 0.0008</w:t>
             </w:r>
           </w:p>
         </w:tc>
@@ -11260,7 +11264,7 @@
                 <w:sz w:val="16"/>
                 <w:szCs w:val="16"/>
               </w:rPr>
-              <w:t xml:space="preserve">35.9</w:t>
+              <w:t xml:space="preserve">36.0</w:t>
             </w:r>
           </w:p>
         </w:tc>
@@ -11285,7 +11289,7 @@
                 <w:sz w:val="16"/>
                 <w:szCs w:val="16"/>
               </w:rPr>
-              <w:t xml:space="preserve">24.0 / 30</w:t>
+              <w:t xml:space="preserve">22.4 / 30</w:t>
             </w:r>
           </w:p>
         </w:tc>
@@ -11310,7 +11314,7 @@
                 <w:sz w:val="16"/>
                 <w:szCs w:val="16"/>
               </w:rPr>
-              <w:t xml:space="preserve">37.4</w:t>
+              <w:t xml:space="preserve">37.2</w:t>
             </w:r>
           </w:p>
         </w:tc>
@@ -11857,7 +11861,7 @@
                 <w:sz w:val="16"/>
                 <w:szCs w:val="16"/>
               </w:rPr>
-              <w:t xml:space="preserve">0.0858 </w:t>
+              <w:t xml:space="preserve">0.0857 </w:t>
             </w:r>
             <w:r>
               <w:rPr>
@@ -11871,7 +11875,7 @@
                 <w:sz w:val="16"/>
                 <w:szCs w:val="16"/>
               </w:rPr>
-              <w:t xml:space="preserve"> 0.0005</w:t>
+              <w:t xml:space="preserve"> 0.0004</w:t>
             </w:r>
           </w:p>
         </w:tc>
@@ -11896,7 +11900,7 @@
                 <w:sz w:val="16"/>
                 <w:szCs w:val="16"/>
               </w:rPr>
-              <w:t xml:space="preserve">0.1756 </w:t>
+              <w:t xml:space="preserve">0.1755 </w:t>
             </w:r>
             <w:r>
               <w:rPr>
@@ -11910,7 +11914,7 @@
                 <w:sz w:val="16"/>
                 <w:szCs w:val="16"/>
               </w:rPr>
-              <w:t xml:space="preserve"> 0.0009</w:t>
+              <w:t xml:space="preserve"> 0.0007</w:t>
             </w:r>
           </w:p>
         </w:tc>
@@ -11949,7 +11953,7 @@
                 <w:sz w:val="16"/>
                 <w:szCs w:val="16"/>
               </w:rPr>
-              <w:t xml:space="preserve"> 0.3</w:t>
+              <w:t xml:space="preserve"> 0.2</w:t>
             </w:r>
           </w:p>
         </w:tc>
@@ -11999,7 +12003,7 @@
                 <w:sz w:val="16"/>
                 <w:szCs w:val="16"/>
               </w:rPr>
-              <w:t xml:space="preserve">25.3 / 30</w:t>
+              <w:t xml:space="preserve">25.2 / 30</w:t>
             </w:r>
           </w:p>
         </w:tc>
@@ -13370,7 +13374,7 @@
           <w:sz w:val="22"/>
           <w:szCs w:val="22"/>
         </w:rPr>
-        <w:t xml:space="preserve">FedAvg with random grouping reached 0.0853 kWh, 5.2 % above centralised, and was worse than centralised for every household. Under moderate heterogeneity (</w:t>
+        <w:t xml:space="preserve">FedAvg with random grouping reached 0.0854 kWh, 5.3 % above centralised, and was worse than centralised for every household. Under moderate heterogeneity (</w:t>
       </w:r>
       <m:oMath>
         <m:r>
@@ -13387,7 +13391,7 @@
           <w:sz w:val="22"/>
           <w:szCs w:val="22"/>
         </w:rPr>
-        <w:t xml:space="preserve">) FedAvg reached 0.0861 kWh and was worse than local-only training on pooled MAE; per household it beat local-only for only 34 % of homes (</w:t>
+        <w:t xml:space="preserve">) FedAvg reached 0.0860 kWh and was worse than local-only training on pooled MAE; per household it beat local-only for only 34 % of homes (</w:t>
       </w:r>
       <m:oMath>
         <m:sSub>
@@ -13421,7 +13425,7 @@
           <w:sz w:val="22"/>
           <w:szCs w:val="22"/>
         </w:rPr>
-        <w:t xml:space="preserve"> 0.0023). On RMSE the ordering reversed: FedAvg (0.1758 kWh) beat local-only (0.1779 kWh). Fig. 2 shows the first three test days of the household whose mean load is closest to the cohort median. All learned models tracked the daily pattern and lagged sharp, short spikes by one step, and the differences between arms were small relative to the volatility of the series.</w:t>
+        <w:t xml:space="preserve"> 0.0047). On RMSE the ordering reversed: FedAvg (0.1757 kWh) beat local-only (0.1779 kWh). Fig. 2 shows the first three test days of the household whose mean load is closest to the cohort median. All learned models tracked the daily pattern and lagged sharp, short spikes by one step, and the differences between arms were small relative to the volatility of the series.</w:t>
       </w:r>
     </w:p>
     <w:p>
@@ -13467,6 +13471,7 @@
     </w:p>
     <w:p>
       <w:pPr>
+        <w:keepLines/>
         <w:spacing w:before="80" w:after="160"/>
         <w:jc w:val="both"/>
       </w:pPr>
@@ -13572,7 +13577,7 @@
           <w:sz w:val="22"/>
           <w:szCs w:val="22"/>
         </w:rPr>
-        <w:t xml:space="preserve"> 0.3138). The gap appeared as soon as the same data were split and grew steadily with the number of clients, from 2.0 % at </w:t>
+        <w:t xml:space="preserve"> 0.2092). The gap appeared as soon as the same data were split and grew steadily with the number of clients, from 2.0 % at </w:t>
       </w:r>
       <m:oMath>
         <m:r>
@@ -13589,7 +13594,7 @@
           <w:sz w:val="22"/>
           <w:szCs w:val="22"/>
         </w:rPr>
-        <w:t xml:space="preserve"> through 5.2 % at </w:t>
+        <w:t xml:space="preserve"> through 5.3 % at </w:t>
       </w:r>
       <m:oMath>
         <m:r>
@@ -13646,6 +13651,7 @@
     <w:p>
       <w:pPr>
         <w:keepNext/>
+        <w:keepLines/>
         <w:spacing w:before="80" w:after="160"/>
         <w:jc w:val="both"/>
       </w:pPr>
@@ -14057,7 +14063,7 @@
                 <w:sz w:val="19"/>
                 <w:szCs w:val="19"/>
               </w:rPr>
-              <w:t xml:space="preserve">-0.0002</w:t>
+              <w:t xml:space="preserve">−0.0002</w:t>
             </w:r>
           </w:p>
         </w:tc>
@@ -14082,7 +14088,7 @@
                 <w:sz w:val="19"/>
                 <w:szCs w:val="19"/>
               </w:rPr>
-              <w:t xml:space="preserve">-0.3</w:t>
+              <w:t xml:space="preserve">−0.3</w:t>
             </w:r>
           </w:p>
         </w:tc>
@@ -14137,7 +14143,7 @@
                 <w:sz w:val="19"/>
                 <w:szCs w:val="19"/>
               </w:rPr>
-              <w:t xml:space="preserve">0.0853 </w:t>
+              <w:t xml:space="preserve">0.0854 </w:t>
             </w:r>
             <w:r>
               <w:rPr>
@@ -14151,7 +14157,7 @@
                 <w:sz w:val="19"/>
                 <w:szCs w:val="19"/>
               </w:rPr>
-              <w:t xml:space="preserve"> 0.0009</w:t>
+              <w:t xml:space="preserve"> 0.0008</w:t>
             </w:r>
           </w:p>
         </w:tc>
@@ -14176,7 +14182,7 @@
                 <w:sz w:val="19"/>
                 <w:szCs w:val="19"/>
               </w:rPr>
-              <w:t xml:space="preserve">+0.0044</w:t>
+              <w:t xml:space="preserve">+0.0046</w:t>
             </w:r>
           </w:p>
         </w:tc>
@@ -14201,7 +14207,7 @@
                 <w:sz w:val="19"/>
                 <w:szCs w:val="19"/>
               </w:rPr>
-              <w:t xml:space="preserve">+5.2</w:t>
+              <w:t xml:space="preserve">+5.3</w:t>
             </w:r>
           </w:p>
         </w:tc>
@@ -14272,7 +14278,7 @@
                 <w:sz w:val="19"/>
                 <w:szCs w:val="19"/>
               </w:rPr>
-              <w:t xml:space="preserve">0.0861 </w:t>
+              <w:t xml:space="preserve">0.0860 </w:t>
             </w:r>
             <w:r>
               <w:rPr>
@@ -14286,7 +14292,7 @@
                 <w:sz w:val="19"/>
                 <w:szCs w:val="19"/>
               </w:rPr>
-              <w:t xml:space="preserve"> 0.0004</w:t>
+              <w:t xml:space="preserve"> 0.0003</w:t>
             </w:r>
           </w:p>
         </w:tc>
@@ -14311,7 +14317,7 @@
                 <w:sz w:val="19"/>
                 <w:szCs w:val="19"/>
               </w:rPr>
-              <w:t xml:space="preserve">+0.0008</w:t>
+              <w:t xml:space="preserve">+0.0006</w:t>
             </w:r>
           </w:p>
         </w:tc>
@@ -14336,7 +14342,7 @@
                 <w:sz w:val="19"/>
                 <w:szCs w:val="19"/>
               </w:rPr>
-              <w:t xml:space="preserve">+6.2</w:t>
+              <w:t xml:space="preserve">+6.0</w:t>
             </w:r>
           </w:p>
         </w:tc>
@@ -14391,7 +14397,7 @@
                 <w:sz w:val="19"/>
                 <w:szCs w:val="19"/>
               </w:rPr>
-              <w:t xml:space="preserve">0.0849 </w:t>
+              <w:t xml:space="preserve">0.0850 </w:t>
             </w:r>
             <w:r>
               <w:rPr>
@@ -14405,7 +14411,7 @@
                 <w:sz w:val="19"/>
                 <w:szCs w:val="19"/>
               </w:rPr>
-              <w:t xml:space="preserve"> 0.0004</w:t>
+              <w:t xml:space="preserve"> 0.0005</w:t>
             </w:r>
           </w:p>
         </w:tc>
@@ -14430,7 +14436,7 @@
                 <w:sz w:val="19"/>
                 <w:szCs w:val="19"/>
               </w:rPr>
-              <w:t xml:space="preserve">-0.0012</w:t>
+              <w:t xml:space="preserve">−0.0009</w:t>
             </w:r>
           </w:p>
         </w:tc>
@@ -14455,7 +14461,7 @@
                 <w:sz w:val="19"/>
                 <w:szCs w:val="19"/>
               </w:rPr>
-              <w:t xml:space="preserve">+4.7</w:t>
+              <w:t xml:space="preserve">+4.9</w:t>
             </w:r>
           </w:p>
         </w:tc>
@@ -14703,6 +14709,7 @@
     <w:p>
       <w:pPr>
         <w:keepNext/>
+        <w:keepLines/>
         <w:spacing w:before="80" w:after="160"/>
         <w:jc w:val="both"/>
       </w:pPr>
@@ -15219,7 +15226,7 @@
                 <w:sz w:val="16"/>
                 <w:szCs w:val="16"/>
               </w:rPr>
-              <w:t xml:space="preserve">-0.3</w:t>
+              <w:t xml:space="preserve">−0.3</w:t>
             </w:r>
           </w:p>
         </w:tc>
@@ -15493,7 +15500,7 @@
                 <w:sz w:val="16"/>
                 <w:szCs w:val="16"/>
               </w:rPr>
-              <w:t xml:space="preserve">0.0105</w:t>
+              <w:t xml:space="preserve">0.0106</w:t>
             </w:r>
           </w:p>
         </w:tc>
@@ -15518,7 +15525,7 @@
                 <w:sz w:val="16"/>
                 <w:szCs w:val="16"/>
               </w:rPr>
-              <w:t xml:space="preserve">0.0853 </w:t>
+              <w:t xml:space="preserve">0.0854 </w:t>
             </w:r>
             <w:r>
               <w:rPr>
@@ -15532,7 +15539,7 @@
                 <w:sz w:val="16"/>
                 <w:szCs w:val="16"/>
               </w:rPr>
-              <w:t xml:space="preserve"> 0.0009</w:t>
+              <w:t xml:space="preserve"> 0.0008</w:t>
             </w:r>
           </w:p>
         </w:tc>
@@ -15557,7 +15564,7 @@
                 <w:sz w:val="16"/>
                 <w:szCs w:val="16"/>
               </w:rPr>
-              <w:t xml:space="preserve">0.0834</w:t>
+              <w:t xml:space="preserve">0.0833</w:t>
             </w:r>
           </w:p>
         </w:tc>
@@ -15582,7 +15589,7 @@
                 <w:sz w:val="16"/>
                 <w:szCs w:val="16"/>
               </w:rPr>
-              <w:t xml:space="preserve">0.856</w:t>
+              <w:t xml:space="preserve">0.858</w:t>
             </w:r>
           </w:p>
         </w:tc>
@@ -15607,7 +15614,7 @@
                 <w:sz w:val="16"/>
                 <w:szCs w:val="16"/>
               </w:rPr>
-              <w:t xml:space="preserve">+5.2</w:t>
+              <w:t xml:space="preserve">+5.3</w:t>
             </w:r>
           </w:p>
         </w:tc>
@@ -16042,6 +16049,7 @@
     </w:p>
     <w:p>
       <w:pPr>
+        <w:keepLines/>
         <w:spacing w:before="80" w:after="160"/>
         <w:jc w:val="both"/>
       </w:pPr>
@@ -16184,7 +16192,7 @@
             <w:sz w:val="22"/>
             <w:szCs w:val="22"/>
           </w:rPr>
-          <m:t>n=24</m:t>
+          <m:t>n=34</m:t>
         </m:r>
       </m:oMath>
       <w:r>
@@ -16223,7 +16231,7 @@
             <w:sz w:val="22"/>
             <w:szCs w:val="22"/>
           </w:rPr>
-          <m:t>=0.88</m:t>
+          <m:t>=0.86</m:t>
         </m:r>
       </m:oMath>
       <w:r>
@@ -16268,7 +16276,7 @@
             <w:sz w:val="22"/>
             <w:szCs w:val="22"/>
           </w:rPr>
-          <m:t>1.33×</m:t>
+          <m:t>1.45×</m:t>
         </m:r>
         <m:sSup>
           <m:e>
@@ -16315,7 +16323,7 @@
           <w:sz w:val="22"/>
           <w:szCs w:val="22"/>
         </w:rPr>
-        <w:t xml:space="preserve"> 0.0070), while the heterogeneity term was not significant (</w:t>
+        <w:t xml:space="preserve"> 0.0004), while the heterogeneity term was not significant (</w:t>
       </w:r>
       <m:oMath>
         <m:r>
@@ -16332,7 +16340,7 @@
           <w:sz w:val="22"/>
           <w:szCs w:val="22"/>
         </w:rPr>
-        <w:t xml:space="preserve"> 0.0553). Within </w:t>
+        <w:t xml:space="preserve"> 0.0449). Within </w:t>
       </w:r>
       <m:oMath>
         <m:r>
@@ -16400,7 +16408,7 @@
           <w:sz w:val="22"/>
           <w:szCs w:val="22"/>
         </w:rPr>
-        <w:t xml:space="preserve"> were unrelated (Spearman +0.23, </w:t>
+        <w:t xml:space="preserve"> were unrelated (Spearman +0.18, </w:t>
       </w:r>
       <m:oMath>
         <m:r>
@@ -16417,7 +16425,7 @@
           <w:sz w:val="22"/>
           <w:szCs w:val="22"/>
         </w:rPr>
-        <w:t xml:space="preserve"> 0.4108, </w:t>
+        <w:t xml:space="preserve"> 0.3812, </w:t>
       </w:r>
       <m:oMath>
         <m:r>
@@ -16426,7 +16434,7 @@
             <w:sz w:val="22"/>
             <w:szCs w:val="22"/>
           </w:rPr>
-          <m:t>n=15</m:t>
+          <m:t>n=25</m:t>
         </m:r>
       </m:oMath>
       <w:r>
@@ -16549,7 +16557,7 @@
           <w:sz w:val="22"/>
           <w:szCs w:val="22"/>
         </w:rPr>
-        <w:t xml:space="preserve"> did not, because random grouping produced a larger spread of client mean load than the Dirichlet groupings, and the cluster partition, which sorts homes by load level, produced the largest spread. Across this range the final FedAvg error moved by at most 0.0012 kWh (from 0.0849 to 0.0861 kWh), comparable to the seed-to-seed standard deviation, and did not trend with </w:t>
+        <w:t xml:space="preserve"> did not, because random grouping produced a larger spread of client mean load than the Dirichlet groupings, and the cluster partition, which sorts homes by load level, produced the largest spread. Across this range the final FedAvg error moved by at most 0.0012 kWh (from 0.0851 to 0.0860 kWh), comparable to the seed-to-seed standard deviation, and did not trend with </w:t>
       </w:r>
       <m:oMath>
         <m:sSub>
@@ -16583,7 +16591,7 @@
           <w:sz w:val="22"/>
           <w:szCs w:val="22"/>
         </w:rPr>
-        <w:t xml:space="preserve">. Per household, FedAvg under the cluster partition was better than under random grouping for 45 % of homes, and the difference was not significant after correction (</w:t>
+        <w:t xml:space="preserve">. Per household, FedAvg under the cluster partition was better than under random grouping for 44 % of homes, and the difference was not significant after correction (</w:t>
       </w:r>
       <m:oMath>
         <m:sSub>
@@ -16617,7 +16625,7 @@
           <w:sz w:val="22"/>
           <w:szCs w:val="22"/>
         </w:rPr>
-        <w:t xml:space="preserve"> 0.0884). The traffic needed to come within 10 % of centralised validation MAE, however, grew from 12.9 MB (4.7 rounds) with random grouping to 21.1 MB at </w:t>
+        <w:t xml:space="preserve"> 0.0638). The traffic needed to come within 10 % of centralised validation MAE, however, grew from 12.7 MB (4.6 rounds) with random grouping to 19.3 MB at </w:t>
       </w:r>
       <m:oMath>
         <m:r>
@@ -16634,12 +16642,13 @@
           <w:sz w:val="22"/>
           <w:szCs w:val="22"/>
         </w:rPr>
-        <w:t xml:space="preserve"> and 23.9 MB under the cluster partition, an increase of about 85 %.</w:t>
+        <w:t xml:space="preserve"> and 18.7 MB under the cluster partition, an increase of about 85 %.</w:t>
       </w:r>
     </w:p>
     <w:p>
       <w:pPr>
         <w:keepNext/>
+        <w:keepLines/>
         <w:spacing w:before="80" w:after="160"/>
         <w:jc w:val="both"/>
       </w:pPr>
@@ -17058,7 +17067,7 @@
                 <w:sz w:val="16"/>
                 <w:szCs w:val="16"/>
               </w:rPr>
-              <w:t xml:space="preserve">0.242</w:t>
+              <w:t xml:space="preserve">0.241</w:t>
             </w:r>
           </w:p>
         </w:tc>
@@ -17083,7 +17092,7 @@
                 <w:sz w:val="16"/>
                 <w:szCs w:val="16"/>
               </w:rPr>
-              <w:t xml:space="preserve">0.0181</w:t>
+              <w:t xml:space="preserve">0.0189</w:t>
             </w:r>
           </w:p>
         </w:tc>
@@ -17108,7 +17117,7 @@
                 <w:sz w:val="16"/>
                 <w:szCs w:val="16"/>
               </w:rPr>
-              <w:t xml:space="preserve">0.876</w:t>
+              <w:t xml:space="preserve">0.874</w:t>
             </w:r>
           </w:p>
         </w:tc>
@@ -17147,7 +17156,7 @@
                 <w:sz w:val="16"/>
                 <w:szCs w:val="16"/>
               </w:rPr>
-              <w:t xml:space="preserve"> 0.0005</w:t>
+              <w:t xml:space="preserve"> 0.0004</w:t>
             </w:r>
           </w:p>
         </w:tc>
@@ -17642,7 +17651,7 @@
                 <w:sz w:val="16"/>
                 <w:szCs w:val="16"/>
               </w:rPr>
-              <w:t xml:space="preserve">FedAvg</w:t>
+              <w:t xml:space="preserve">FedProx</w:t>
             </w:r>
           </w:p>
         </w:tc>
@@ -17717,7 +17726,7 @@
                 <w:sz w:val="16"/>
                 <w:szCs w:val="16"/>
               </w:rPr>
-              <w:t xml:space="preserve">0.874</w:t>
+              <w:t xml:space="preserve">0.861</w:t>
             </w:r>
           </w:p>
         </w:tc>
@@ -17742,7 +17751,7 @@
                 <w:sz w:val="16"/>
                 <w:szCs w:val="16"/>
               </w:rPr>
-              <w:t xml:space="preserve">0.0861 </w:t>
+              <w:t xml:space="preserve">0.0858 </w:t>
             </w:r>
             <w:r>
               <w:rPr>
@@ -17756,7 +17765,7 @@
                 <w:sz w:val="16"/>
                 <w:szCs w:val="16"/>
               </w:rPr>
-              <w:t xml:space="preserve"> 0.0004</w:t>
+              <w:t xml:space="preserve"> 0.0001</w:t>
             </w:r>
           </w:p>
         </w:tc>
@@ -17781,7 +17790,7 @@
                 <w:sz w:val="16"/>
                 <w:szCs w:val="16"/>
               </w:rPr>
-              <w:t xml:space="preserve">+6.2</w:t>
+              <w:t xml:space="preserve">+5.9</w:t>
             </w:r>
           </w:p>
         </w:tc>
@@ -17845,7 +17854,7 @@
                 <w:sz w:val="16"/>
                 <w:szCs w:val="16"/>
               </w:rPr>
-              <w:t xml:space="preserve">FedProx</w:t>
+              <w:t xml:space="preserve">HA-FedProx</w:t>
             </w:r>
           </w:p>
         </w:tc>
@@ -17920,7 +17929,7 @@
                 <w:sz w:val="16"/>
                 <w:szCs w:val="16"/>
               </w:rPr>
-              <w:t xml:space="preserve">0.861</w:t>
+              <w:t xml:space="preserve">0.844</w:t>
             </w:r>
           </w:p>
         </w:tc>
@@ -17945,7 +17954,7 @@
                 <w:sz w:val="16"/>
                 <w:szCs w:val="16"/>
               </w:rPr>
-              <w:t xml:space="preserve">0.0858 </w:t>
+              <w:t xml:space="preserve">0.0863 </w:t>
             </w:r>
             <w:r>
               <w:rPr>
@@ -17959,7 +17968,7 @@
                 <w:sz w:val="16"/>
                 <w:szCs w:val="16"/>
               </w:rPr>
-              <w:t xml:space="preserve"> 0.0001</w:t>
+              <w:t xml:space="preserve"> 0.0003</w:t>
             </w:r>
           </w:p>
         </w:tc>
@@ -17984,7 +17993,7 @@
                 <w:sz w:val="16"/>
                 <w:szCs w:val="16"/>
               </w:rPr>
-              <w:t xml:space="preserve">+5.9</w:t>
+              <w:t xml:space="preserve">+6.5</w:t>
             </w:r>
           </w:p>
         </w:tc>
@@ -18048,7 +18057,7 @@
                 <w:sz w:val="16"/>
                 <w:szCs w:val="16"/>
               </w:rPr>
-              <w:t xml:space="preserve">HA-FedProx</w:t>
+              <w:t xml:space="preserve">FedAvg</w:t>
             </w:r>
           </w:p>
         </w:tc>
@@ -18073,7 +18082,7 @@
                 <w:sz w:val="16"/>
                 <w:szCs w:val="16"/>
               </w:rPr>
-              <w:t xml:space="preserve">0.243</w:t>
+              <w:t xml:space="preserve">0.246</w:t>
             </w:r>
           </w:p>
         </w:tc>
@@ -18098,7 +18107,7 @@
                 <w:sz w:val="16"/>
                 <w:szCs w:val="16"/>
               </w:rPr>
-              <w:t xml:space="preserve">0.0153</w:t>
+              <w:t xml:space="preserve">0.0152</w:t>
             </w:r>
           </w:p>
         </w:tc>
@@ -18123,7 +18132,7 @@
                 <w:sz w:val="16"/>
                 <w:szCs w:val="16"/>
               </w:rPr>
-              <w:t xml:space="preserve">0.844</w:t>
+              <w:t xml:space="preserve">0.871</w:t>
             </w:r>
           </w:p>
         </w:tc>
@@ -18148,7 +18157,7 @@
                 <w:sz w:val="16"/>
                 <w:szCs w:val="16"/>
               </w:rPr>
-              <w:t xml:space="preserve">0.0863 </w:t>
+              <w:t xml:space="preserve">0.0860 </w:t>
             </w:r>
             <w:r>
               <w:rPr>
@@ -18187,7 +18196,7 @@
                 <w:sz w:val="16"/>
                 <w:szCs w:val="16"/>
               </w:rPr>
-              <w:t xml:space="preserve">+6.5</w:t>
+              <w:t xml:space="preserve">+6.0</w:t>
             </w:r>
           </w:p>
         </w:tc>
@@ -18267,7 +18276,7 @@
                 <w:sz w:val="16"/>
                 <w:szCs w:val="16"/>
               </w:rPr>
-              <w:t xml:space="preserve">0.255</w:t>
+              <w:t xml:space="preserve">0.253</w:t>
             </w:r>
           </w:p>
         </w:tc>
@@ -18292,7 +18301,7 @@
                 <w:sz w:val="16"/>
                 <w:szCs w:val="16"/>
               </w:rPr>
-              <w:t xml:space="preserve">0.0105</w:t>
+              <w:t xml:space="preserve">0.0106</w:t>
             </w:r>
           </w:p>
         </w:tc>
@@ -18317,7 +18326,7 @@
                 <w:sz w:val="16"/>
                 <w:szCs w:val="16"/>
               </w:rPr>
-              <w:t xml:space="preserve">0.856</w:t>
+              <w:t xml:space="preserve">0.858</w:t>
             </w:r>
           </w:p>
         </w:tc>
@@ -18342,7 +18351,7 @@
                 <w:sz w:val="16"/>
                 <w:szCs w:val="16"/>
               </w:rPr>
-              <w:t xml:space="preserve">0.0853 </w:t>
+              <w:t xml:space="preserve">0.0854 </w:t>
             </w:r>
             <w:r>
               <w:rPr>
@@ -18356,7 +18365,7 @@
                 <w:sz w:val="16"/>
                 <w:szCs w:val="16"/>
               </w:rPr>
-              <w:t xml:space="preserve"> 0.0009</w:t>
+              <w:t xml:space="preserve"> 0.0008</w:t>
             </w:r>
           </w:p>
         </w:tc>
@@ -18381,7 +18390,7 @@
                 <w:sz w:val="16"/>
                 <w:szCs w:val="16"/>
               </w:rPr>
-              <w:t xml:space="preserve">+5.2</w:t>
+              <w:t xml:space="preserve">+5.3</w:t>
             </w:r>
           </w:p>
         </w:tc>
@@ -18858,7 +18867,7 @@
                 <w:sz w:val="16"/>
                 <w:szCs w:val="16"/>
               </w:rPr>
-              <w:t xml:space="preserve">0.270</w:t>
+              <w:t xml:space="preserve">0.262</w:t>
             </w:r>
           </w:p>
         </w:tc>
@@ -18883,7 +18892,7 @@
                 <w:sz w:val="16"/>
                 <w:szCs w:val="16"/>
               </w:rPr>
-              <w:t xml:space="preserve">0.0124</w:t>
+              <w:t xml:space="preserve">0.0125</w:t>
             </w:r>
           </w:p>
         </w:tc>
@@ -18908,7 +18917,7 @@
                 <w:sz w:val="16"/>
                 <w:szCs w:val="16"/>
               </w:rPr>
-              <w:t xml:space="preserve">0.867</w:t>
+              <w:t xml:space="preserve">0.868</w:t>
             </w:r>
           </w:p>
         </w:tc>
@@ -18933,7 +18942,7 @@
                 <w:sz w:val="16"/>
                 <w:szCs w:val="16"/>
               </w:rPr>
-              <w:t xml:space="preserve">0.0849 </w:t>
+              <w:t xml:space="preserve">0.0851 </w:t>
             </w:r>
             <w:r>
               <w:rPr>
@@ -18947,7 +18956,7 @@
                 <w:sz w:val="16"/>
                 <w:szCs w:val="16"/>
               </w:rPr>
-              <w:t xml:space="preserve"> 0.0006</w:t>
+              <w:t xml:space="preserve"> 0.0007</w:t>
             </w:r>
           </w:p>
         </w:tc>
@@ -18972,7 +18981,7 @@
                 <w:sz w:val="16"/>
                 <w:szCs w:val="16"/>
               </w:rPr>
-              <w:t xml:space="preserve">+4.7</w:t>
+              <w:t xml:space="preserve">+5.0</w:t>
             </w:r>
           </w:p>
         </w:tc>
@@ -19433,7 +19442,7 @@
                 <w:sz w:val="16"/>
                 <w:szCs w:val="16"/>
               </w:rPr>
-              <w:t xml:space="preserve">FedAvg</w:t>
+              <w:t xml:space="preserve">FedProx</w:t>
             </w:r>
           </w:p>
         </w:tc>
@@ -19508,7 +19517,7 @@
                 <w:sz w:val="16"/>
                 <w:szCs w:val="16"/>
               </w:rPr>
-              <w:t xml:space="preserve">0.876</w:t>
+              <w:t xml:space="preserve">0.866</w:t>
             </w:r>
           </w:p>
         </w:tc>
@@ -19533,7 +19542,7 @@
                 <w:sz w:val="16"/>
                 <w:szCs w:val="16"/>
               </w:rPr>
-              <w:t xml:space="preserve">0.0857 </w:t>
+              <w:t xml:space="preserve">0.0858 </w:t>
             </w:r>
             <w:r>
               <w:rPr>
@@ -19547,7 +19556,7 @@
                 <w:sz w:val="16"/>
                 <w:szCs w:val="16"/>
               </w:rPr>
-              <w:t xml:space="preserve"> 0.0003</w:t>
+              <w:t xml:space="preserve"> 0.0002</w:t>
             </w:r>
           </w:p>
         </w:tc>
@@ -19572,7 +19581,7 @@
                 <w:sz w:val="16"/>
                 <w:szCs w:val="16"/>
               </w:rPr>
-              <w:t xml:space="preserve">+5.7</w:t>
+              <w:t xml:space="preserve">+5.8</w:t>
             </w:r>
           </w:p>
         </w:tc>
@@ -19627,7 +19636,7 @@
                 <w:sz w:val="16"/>
                 <w:szCs w:val="16"/>
               </w:rPr>
-              <w:t xml:space="preserve">FedProx</w:t>
+              <w:t xml:space="preserve">HA-FedProx</w:t>
             </w:r>
           </w:p>
         </w:tc>
@@ -19702,7 +19711,7 @@
                 <w:sz w:val="16"/>
                 <w:szCs w:val="16"/>
               </w:rPr>
-              <w:t xml:space="preserve">0.866</w:t>
+              <w:t xml:space="preserve">0.851</w:t>
             </w:r>
           </w:p>
         </w:tc>
@@ -19727,7 +19736,7 @@
                 <w:sz w:val="16"/>
                 <w:szCs w:val="16"/>
               </w:rPr>
-              <w:t xml:space="preserve">0.0858 </w:t>
+              <w:t xml:space="preserve">0.0865 </w:t>
             </w:r>
             <w:r>
               <w:rPr>
@@ -19766,7 +19775,7 @@
                 <w:sz w:val="16"/>
                 <w:szCs w:val="16"/>
               </w:rPr>
-              <w:t xml:space="preserve">+5.8</w:t>
+              <w:t xml:space="preserve">+6.7</w:t>
             </w:r>
           </w:p>
         </w:tc>
@@ -19819,7 +19828,7 @@
                 <w:sz w:val="16"/>
                 <w:szCs w:val="16"/>
               </w:rPr>
-              <w:t xml:space="preserve">HA-FedProx</w:t>
+              <w:t xml:space="preserve">FedAvg</w:t>
             </w:r>
           </w:p>
         </w:tc>
@@ -19891,7 +19900,7 @@
                 <w:sz w:val="16"/>
                 <w:szCs w:val="16"/>
               </w:rPr>
-              <w:t xml:space="preserve">0.851</w:t>
+              <w:t xml:space="preserve">0.876</w:t>
             </w:r>
           </w:p>
         </w:tc>
@@ -19915,7 +19924,7 @@
                 <w:sz w:val="16"/>
                 <w:szCs w:val="16"/>
               </w:rPr>
-              <w:t xml:space="preserve">0.0865 </w:t>
+              <w:t xml:space="preserve">0.0857 </w:t>
             </w:r>
             <w:r>
               <w:rPr>
@@ -19929,7 +19938,7 @@
                 <w:sz w:val="16"/>
                 <w:szCs w:val="16"/>
               </w:rPr>
-              <w:t xml:space="preserve"> 0.0002</w:t>
+              <w:t xml:space="preserve"> 0.0003</w:t>
             </w:r>
           </w:p>
         </w:tc>
@@ -19953,7 +19962,7 @@
                 <w:sz w:val="16"/>
                 <w:szCs w:val="16"/>
               </w:rPr>
-              <w:t xml:space="preserve">+6.7</w:t>
+              <w:t xml:space="preserve">+5.7</w:t>
             </w:r>
           </w:p>
         </w:tc>
@@ -20007,6 +20016,7 @@
     </w:p>
     <w:p>
       <w:pPr>
+        <w:keepLines/>
         <w:spacing w:before="80" w:after="160"/>
         <w:jc w:val="both"/>
       </w:pPr>
@@ -20202,12 +20212,13 @@
           <w:sz w:val="22"/>
           <w:szCs w:val="22"/>
         </w:rPr>
-        <w:t xml:space="preserve"> FedProx was better for 75 % of households, but the median paired difference was -0.0001 kWh, about 0.1 % of the error. Under the cluster partition and under partial participation FedProx was slightly worse.</w:t>
+        <w:t xml:space="preserve"> FedProx was better for 69 % of households, but the median paired difference was -0.0001 kWh, about 0.1 % of the error. Under the cluster partition and under partial participation FedProx was slightly worse.</w:t>
       </w:r>
     </w:p>
     <w:p>
       <w:pPr>
         <w:keepNext/>
+        <w:keepLines/>
         <w:spacing w:before="80" w:after="160"/>
         <w:jc w:val="both"/>
       </w:pPr>
@@ -20624,7 +20635,7 @@
                 <w:sz w:val="17"/>
                 <w:szCs w:val="17"/>
               </w:rPr>
-              <w:t xml:space="preserve">+0.0013</w:t>
+              <w:t xml:space="preserve">+0.0012</w:t>
             </w:r>
           </w:p>
         </w:tc>
@@ -20674,7 +20685,7 @@
                 <w:sz w:val="17"/>
                 <w:szCs w:val="17"/>
               </w:rPr>
-              <w:t xml:space="preserve">0.0002</w:t>
+              <w:t xml:space="preserve">0.0005</w:t>
             </w:r>
           </w:p>
         </w:tc>
@@ -20699,7 +20710,7 @@
                 <w:sz w:val="17"/>
                 <w:szCs w:val="17"/>
               </w:rPr>
-              <w:t xml:space="preserve">0.0023</w:t>
+              <w:t xml:space="preserve">0.0047</w:t>
             </w:r>
           </w:p>
         </w:tc>
@@ -20795,7 +20806,7 @@
                 <w:sz w:val="17"/>
                 <w:szCs w:val="17"/>
               </w:rPr>
-              <w:t xml:space="preserve">+0.0026</w:t>
+              <w:t xml:space="preserve">+0.0025</w:t>
             </w:r>
           </w:p>
         </w:tc>
@@ -21225,7 +21236,7 @@
                 <w:sz w:val="17"/>
                 <w:szCs w:val="17"/>
               </w:rPr>
-              <w:t xml:space="preserve">-0.0001</w:t>
+              <w:t xml:space="preserve">−0.0001</w:t>
             </w:r>
           </w:p>
         </w:tc>
@@ -21250,7 +21261,7 @@
                 <w:sz w:val="17"/>
                 <w:szCs w:val="17"/>
               </w:rPr>
-              <w:t xml:space="preserve">75</w:t>
+              <w:t xml:space="preserve">69</w:t>
             </w:r>
           </w:p>
         </w:tc>
@@ -21275,76 +21286,32 @@
                 <w:sz w:val="17"/>
                 <w:szCs w:val="17"/>
               </w:rPr>
-              <w:t xml:space="preserve">&lt;</w:t>
-            </w:r>
+              <w:t xml:space="preserve">0.0007</w:t>
+            </w:r>
+          </w:p>
+        </w:tc>
+        <w:tc>
+          <w:tcPr>
+            <w:tcW w:w="724" w:type="dxa"/>
+            <w:tcMar>
+              <w:top w:w="40" w:type="dxa"/>
+              <w:left w:w="80" w:type="dxa"/>
+              <w:bottom w:w="40" w:type="dxa"/>
+              <w:right w:w="80" w:type="dxa"/>
+            </w:tcMar>
+          </w:tcPr>
+          <w:p>
+            <w:pPr>
+              <w:keepNext/>
+              <w:spacing w:before="0" w:after="0" w:line="240" w:lineRule="auto"/>
+              <w:jc w:val="right"/>
+            </w:pPr>
             <w:r>
               <w:rPr>
                 <w:sz w:val="17"/>
                 <w:szCs w:val="17"/>
               </w:rPr>
-              <w:t xml:space="preserve">1</w:t>
-            </w:r>
-            <w:r>
-              <w:rPr>
-                <w:sz w:val="17"/>
-                <w:szCs w:val="17"/>
-              </w:rPr>
-              <w:t xml:space="preserve">0</w:t>
-            </w:r>
-            <w:r>
-              <w:rPr>
-                <w:sz w:val="17"/>
-                <w:szCs w:val="17"/>
-                <w:vertAlign w:val="superscript"/>
-              </w:rPr>
-              <w:t xml:space="preserve">−4</w:t>
-            </w:r>
-          </w:p>
-        </w:tc>
-        <w:tc>
-          <w:tcPr>
-            <w:tcW w:w="724" w:type="dxa"/>
-            <w:tcMar>
-              <w:top w:w="40" w:type="dxa"/>
-              <w:left w:w="80" w:type="dxa"/>
-              <w:bottom w:w="40" w:type="dxa"/>
-              <w:right w:w="80" w:type="dxa"/>
-            </w:tcMar>
-          </w:tcPr>
-          <w:p>
-            <w:pPr>
-              <w:keepNext/>
-              <w:spacing w:before="0" w:after="0" w:line="240" w:lineRule="auto"/>
-              <w:jc w:val="right"/>
-            </w:pPr>
-            <w:r>
-              <w:rPr>
-                <w:sz w:val="17"/>
-                <w:szCs w:val="17"/>
-              </w:rPr>
-              <w:t xml:space="preserve">&lt;</w:t>
-            </w:r>
-            <w:r>
-              <w:rPr>
-                <w:sz w:val="17"/>
-                <w:szCs w:val="17"/>
-              </w:rPr>
-              <w:t xml:space="preserve">1</w:t>
-            </w:r>
-            <w:r>
-              <w:rPr>
-                <w:sz w:val="17"/>
-                <w:szCs w:val="17"/>
-              </w:rPr>
-              <w:t xml:space="preserve">0</w:t>
-            </w:r>
-            <w:r>
-              <w:rPr>
-                <w:sz w:val="17"/>
-                <w:szCs w:val="17"/>
-                <w:vertAlign w:val="superscript"/>
-              </w:rPr>
-              <w:t xml:space="preserve">−4</w:t>
+              <w:t xml:space="preserve">0.0061</w:t>
             </w:r>
           </w:p>
         </w:tc>
@@ -21449,7 +21416,7 @@
                 <w:sz w:val="17"/>
                 <w:szCs w:val="17"/>
               </w:rPr>
-              <w:t xml:space="preserve">36</w:t>
+              <w:t xml:space="preserve">31</w:t>
             </w:r>
           </w:p>
         </w:tc>
@@ -21474,7 +21441,7 @@
                 <w:sz w:val="17"/>
                 <w:szCs w:val="17"/>
               </w:rPr>
-              <w:t xml:space="preserve">0.0011</w:t>
+              <w:t xml:space="preserve">0.0004</w:t>
             </w:r>
           </w:p>
         </w:tc>
@@ -21499,7 +21466,7 @@
                 <w:sz w:val="17"/>
                 <w:szCs w:val="17"/>
               </w:rPr>
-              <w:t xml:space="preserve">0.0103</w:t>
+              <w:t xml:space="preserve">0.0047</w:t>
             </w:r>
           </w:p>
         </w:tc>
@@ -21636,7 +21603,7 @@
                 <w:sz w:val="17"/>
                 <w:szCs w:val="17"/>
               </w:rPr>
-              <w:t xml:space="preserve">24</w:t>
+              <w:t xml:space="preserve">19</w:t>
             </w:r>
           </w:p>
         </w:tc>
@@ -21842,7 +21809,7 @@
                 <w:sz w:val="17"/>
                 <w:szCs w:val="17"/>
               </w:rPr>
-              <w:t xml:space="preserve">+0.0000</w:t>
+              <w:t xml:space="preserve">+0.0001</w:t>
             </w:r>
           </w:p>
         </w:tc>
@@ -21867,7 +21834,7 @@
                 <w:sz w:val="17"/>
                 <w:szCs w:val="17"/>
               </w:rPr>
-              <w:t xml:space="preserve">44</w:t>
+              <w:t xml:space="preserve">42</w:t>
             </w:r>
           </w:p>
         </w:tc>
@@ -21892,7 +21859,7 @@
                 <w:sz w:val="17"/>
                 <w:szCs w:val="17"/>
               </w:rPr>
-              <w:t xml:space="preserve">0.2480</w:t>
+              <w:t xml:space="preserve">0.0674</w:t>
             </w:r>
           </w:p>
         </w:tc>
@@ -21917,7 +21884,7 @@
                 <w:sz w:val="17"/>
                 <w:szCs w:val="17"/>
               </w:rPr>
-              <w:t xml:space="preserve">0.4960</w:t>
+              <w:t xml:space="preserve">0.2021</w:t>
             </w:r>
           </w:p>
         </w:tc>
@@ -22184,7 +22151,7 @@
                 <w:sz w:val="17"/>
                 <w:szCs w:val="17"/>
               </w:rPr>
-              <w:t xml:space="preserve">+0.0004</w:t>
+              <w:t xml:space="preserve">+0.0003</w:t>
             </w:r>
           </w:p>
         </w:tc>
@@ -22209,7 +22176,7 @@
                 <w:sz w:val="17"/>
                 <w:szCs w:val="17"/>
               </w:rPr>
-              <w:t xml:space="preserve">27</w:t>
+              <w:t xml:space="preserve">25</w:t>
             </w:r>
           </w:p>
         </w:tc>
@@ -22458,7 +22425,7 @@
                 <w:sz w:val="17"/>
                 <w:szCs w:val="17"/>
               </w:rPr>
-              <w:t xml:space="preserve">0.0103</w:t>
+              <w:t xml:space="preserve">0.0093</w:t>
             </w:r>
           </w:p>
         </w:tc>
@@ -22570,7 +22537,7 @@
                 <w:sz w:val="17"/>
                 <w:szCs w:val="17"/>
               </w:rPr>
-              <w:t xml:space="preserve">+0.0003</w:t>
+              <w:t xml:space="preserve">+0.0004</w:t>
             </w:r>
           </w:p>
         </w:tc>
@@ -22595,7 +22562,7 @@
                 <w:sz w:val="17"/>
                 <w:szCs w:val="17"/>
               </w:rPr>
-              <w:t xml:space="preserve">21</w:t>
+              <w:t xml:space="preserve">22</w:t>
             </w:r>
           </w:p>
         </w:tc>
@@ -22981,7 +22948,7 @@
                 <w:sz w:val="17"/>
                 <w:szCs w:val="17"/>
               </w:rPr>
-              <w:t xml:space="preserve">45</w:t>
+              <w:t xml:space="preserve">44</w:t>
             </w:r>
           </w:p>
         </w:tc>
@@ -23006,7 +22973,7 @@
                 <w:sz w:val="17"/>
                 <w:szCs w:val="17"/>
               </w:rPr>
-              <w:t xml:space="preserve">0.0177</w:t>
+              <w:t xml:space="preserve">0.0106</w:t>
             </w:r>
           </w:p>
         </w:tc>
@@ -23031,7 +22998,7 @@
                 <w:sz w:val="17"/>
                 <w:szCs w:val="17"/>
               </w:rPr>
-              <w:t xml:space="preserve">0.0884</w:t>
+              <w:t xml:space="preserve">0.0638</w:t>
             </w:r>
           </w:p>
         </w:tc>
@@ -23740,7 +23707,7 @@
                 <w:sz w:val="17"/>
                 <w:szCs w:val="17"/>
               </w:rPr>
-              <w:t xml:space="preserve">-0.0002</w:t>
+              <w:t xml:space="preserve">−0.0001</w:t>
             </w:r>
           </w:p>
         </w:tc>
@@ -23939,7 +23906,7 @@
                 <w:sz w:val="17"/>
                 <w:szCs w:val="17"/>
               </w:rPr>
-              <w:t xml:space="preserve">-0.0016</w:t>
+              <w:t xml:space="preserve">−0.0016</w:t>
             </w:r>
           </w:p>
         </w:tc>
@@ -24138,7 +24105,7 @@
                 <w:sz w:val="17"/>
                 <w:szCs w:val="17"/>
               </w:rPr>
-              <w:t xml:space="preserve">-0.0000</w:t>
+              <w:t xml:space="preserve">−0.0000</w:t>
             </w:r>
           </w:p>
         </w:tc>
@@ -24213,7 +24180,7 @@
                 <w:sz w:val="17"/>
                 <w:szCs w:val="17"/>
               </w:rPr>
-              <w:t xml:space="preserve">0.3138</w:t>
+              <w:t xml:space="preserve">0.2092</w:t>
             </w:r>
           </w:p>
         </w:tc>
@@ -24508,7 +24475,7 @@
                 <w:sz w:val="17"/>
                 <w:szCs w:val="17"/>
               </w:rPr>
-              <w:t xml:space="preserve">-0.0004</w:t>
+              <w:t xml:space="preserve">−0.0001</w:t>
             </w:r>
           </w:p>
         </w:tc>
@@ -24533,7 +24500,7 @@
                 <w:sz w:val="17"/>
                 <w:szCs w:val="17"/>
               </w:rPr>
-              <w:t xml:space="preserve">52</w:t>
+              <w:t xml:space="preserve">51</w:t>
             </w:r>
           </w:p>
         </w:tc>
@@ -24558,7 +24525,7 @@
                 <w:sz w:val="17"/>
                 <w:szCs w:val="17"/>
               </w:rPr>
-              <w:t xml:space="preserve">0.3900</w:t>
+              <w:t xml:space="preserve">0.4960</w:t>
             </w:r>
           </w:p>
         </w:tc>
@@ -24679,7 +24646,7 @@
                 <w:sz w:val="17"/>
                 <w:szCs w:val="17"/>
               </w:rPr>
-              <w:t xml:space="preserve">+0.0010</w:t>
+              <w:t xml:space="preserve">+0.0013</w:t>
             </w:r>
           </w:p>
         </w:tc>
@@ -24704,7 +24671,7 @@
                 <w:sz w:val="17"/>
                 <w:szCs w:val="17"/>
               </w:rPr>
-              <w:t xml:space="preserve">27</w:t>
+              <w:t xml:space="preserve">26</w:t>
             </w:r>
           </w:p>
         </w:tc>
@@ -24947,7 +24914,7 @@
                 <w:sz w:val="17"/>
                 <w:szCs w:val="17"/>
               </w:rPr>
-              <w:t xml:space="preserve">0.0854</w:t>
+              <w:t xml:space="preserve">0.0711</w:t>
             </w:r>
           </w:p>
         </w:tc>
@@ -24968,7 +24935,7 @@
           <w:sz w:val="22"/>
           <w:szCs w:val="22"/>
         </w:rPr>
-        <w:t xml:space="preserve">HA-FedProx never improved on FedAvg. Under the cluster partition it was worse for 73 % of households (median +0.0004 kWh, </w:t>
+        <w:t xml:space="preserve">HA-FedProx never improved on FedAvg. Under the cluster partition it was worse for 75 % of households (median +0.0003 kWh, </w:t>
       </w:r>
       <m:oMath>
         <m:sSub>
@@ -25059,7 +25026,7 @@
           <w:sz w:val="22"/>
           <w:szCs w:val="22"/>
         </w:rPr>
-        <w:t xml:space="preserve"> band (35.8 MB against 12.9 MB for FedAvg). Fig. 5 shows the update-disagreement ratio. It started low (0.15 on average in round 1), rose quickly and settled near 0.96. Across the full-participation runs with </w:t>
+        <w:t xml:space="preserve"> band (35.8 MB against 12.7 MB for FedAvg). Fig. 5 shows the update-disagreement ratio. It started low (0.15 on average in round 1), rose quickly and settled near 0.96. Across the full-participation runs with </w:t>
       </w:r>
       <m:oMath>
         <m:r>
@@ -25127,7 +25094,7 @@
           <w:sz w:val="22"/>
           <w:szCs w:val="22"/>
         </w:rPr>
-        <w:t xml:space="preserve"> (Spearman +0.77, </w:t>
+        <w:t xml:space="preserve"> (Spearman +0.51, </w:t>
       </w:r>
       <m:oMath>
         <m:r>
@@ -25144,7 +25111,7 @@
           <w:sz w:val="22"/>
           <w:szCs w:val="22"/>
         </w:rPr>
-        <w:t xml:space="preserve"> 0.0002, </w:t>
+        <w:t xml:space="preserve"> 0.0044, </w:t>
       </w:r>
       <m:oMath>
         <m:r>
@@ -25153,7 +25120,7 @@
             <w:sz w:val="22"/>
             <w:szCs w:val="22"/>
           </w:rPr>
-          <m:t>n=18</m:t>
+          <m:t>n=30</m:t>
         </m:r>
       </m:oMath>
       <w:r>
@@ -25161,7 +25128,7 @@
           <w:sz w:val="22"/>
           <w:szCs w:val="22"/>
         </w:rPr>
-        <w:t xml:space="preserve">), and the round-1 value did so more strongly (Spearman +0.88). The spread of mean </w:t>
+        <w:t xml:space="preserve">), and the round-1 value did so more strongly (Spearman +0.52). The spread of mean </w:t>
       </w:r>
       <m:oMath>
         <m:r>
@@ -25178,7 +25145,7 @@
           <w:sz w:val="22"/>
           <w:szCs w:val="22"/>
         </w:rPr>
-        <w:t xml:space="preserve"> across groupings was only 0.020, however, whereas </w:t>
+        <w:t xml:space="preserve"> across groupings was only 0.017, however, whereas </w:t>
       </w:r>
       <m:oMath>
         <m:sSub>
@@ -25209,7 +25176,7 @@
           <w:sz w:val="22"/>
           <w:szCs w:val="22"/>
         </w:rPr>
-        <w:t xml:space="preserve"> rose by 0.81 within a typical run, about 40 times more.</w:t>
+        <w:t xml:space="preserve"> rose by 0.81 within a typical run, about 46 times more.</w:t>
       </w:r>
     </w:p>
     <w:p>
@@ -25255,6 +25222,7 @@
     </w:p>
     <w:p>
       <w:pPr>
+        <w:keepLines/>
         <w:spacing w:before="80" w:after="160"/>
         <w:jc w:val="both"/>
       </w:pPr>
@@ -25391,7 +25359,7 @@
           <w:sz w:val="22"/>
           <w:szCs w:val="22"/>
         </w:rPr>
-        <w:t xml:space="preserve"> band after 6.2 MB and ended at 0.0849 kWh, no worse than full participation, using 37.4 MB in total. Sending updates as 16-bit floats halved the traffic (41.3 MB in total, 11.5 MB to the </w:t>
+        <w:t xml:space="preserve"> band after 6.7 MB and ended at 0.0850 kWh, no worse than full participation, using 37.2 MB in total. Sending updates as 16-bit floats halved the traffic (41.3 MB in total, 10.2 MB to the </w:t>
       </w:r>
       <m:oMath>
         <m:r>
@@ -25408,7 +25376,7 @@
           <w:sz w:val="22"/>
           <w:szCs w:val="22"/>
         </w:rPr>
-        <w:t xml:space="preserve"> band) without harming accuracy: 0.0858 kWh against 0.0861 kWh at 32 bits, and marginally better for 92 % of households (median -0.0002 kWh).</w:t>
+        <w:t xml:space="preserve"> band) without harming accuracy: 0.0857 kWh against 0.0860 kWh at 32 bits, and marginally better for 92 % of households (median -0.0001 kWh).</w:t>
       </w:r>
     </w:p>
     <w:p>
@@ -25515,6 +25483,7 @@
     </w:p>
     <w:p>
       <w:pPr>
+        <w:keepLines/>
         <w:spacing w:before="80" w:after="160"/>
         <w:jc w:val="both"/>
       </w:pPr>
@@ -25586,7 +25555,7 @@
           <w:sz w:val="22"/>
           <w:szCs w:val="22"/>
         </w:rPr>
-        <w:t xml:space="preserve">) worse off, and one epoch of local fine-tuning reduced this to 46–48 %. After fine-tuning, FedAvg was statistically indistinguishable from local training per household (52 % better, </w:t>
+        <w:t xml:space="preserve">) worse off, and one epoch of local fine-tuning reduced this to 51–49 %. After fine-tuning, FedAvg was statistically indistinguishable from local training per household (51 % better, </w:t>
       </w:r>
       <m:oMath>
         <m:sSub>
@@ -25620,7 +25589,7 @@
           <w:sz w:val="22"/>
           <w:szCs w:val="22"/>
         </w:rPr>
-        <w:t xml:space="preserve"> 0.4960), improved pooled MAE to 0.0834 kWh, and remained behind centralised training (27 % of households better). With household clients FedAvg was worse than local training for 82 % of households (</w:t>
+        <w:t xml:space="preserve"> 0.4960), improved pooled MAE to 0.0833 kWh, and remained behind centralised training (26 % of households better). With household clients FedAvg was worse than local training for 82 % of households (</w:t>
       </w:r>
       <m:oMath>
         <m:sSub>
@@ -25728,12 +25697,13 @@
           <w:sz w:val="22"/>
           <w:szCs w:val="22"/>
         </w:rPr>
-        <w:t xml:space="preserve"> 0.0854). By consumption quintile, the advantage of pooling raw data was concentrated in the highest-consuming homes, and in the top quintile the median household error of FedAvg was above that of local training.</w:t>
+        <w:t xml:space="preserve"> 0.0711). By consumption quintile, the advantage of pooling raw data was concentrated in the highest-consuming homes, and in the top quintile the median household error of FedAvg was above that of local training.</w:t>
       </w:r>
     </w:p>
     <w:p>
       <w:pPr>
         <w:keepNext/>
+        <w:keepLines/>
         <w:spacing w:before="80" w:after="160"/>
         <w:jc w:val="both"/>
       </w:pPr>
@@ -26145,7 +26115,7 @@
                 <w:sz w:val="17"/>
                 <w:szCs w:val="17"/>
               </w:rPr>
-              <w:t xml:space="preserve">-0.0005</w:t>
+              <w:t xml:space="preserve">−0.0007</w:t>
             </w:r>
           </w:p>
         </w:tc>
@@ -26170,7 +26140,7 @@
                 <w:sz w:val="17"/>
                 <w:szCs w:val="17"/>
               </w:rPr>
-              <w:t xml:space="preserve">0.1439</w:t>
+              <w:t xml:space="preserve">0.1436</w:t>
             </w:r>
           </w:p>
         </w:tc>
@@ -26195,7 +26165,7 @@
                 <w:sz w:val="17"/>
                 <w:szCs w:val="17"/>
               </w:rPr>
-              <w:t xml:space="preserve">46</w:t>
+              <w:t xml:space="preserve">51</w:t>
             </w:r>
           </w:p>
         </w:tc>
@@ -26291,7 +26261,7 @@
                 <w:sz w:val="17"/>
                 <w:szCs w:val="17"/>
               </w:rPr>
-              <w:t xml:space="preserve">-0.0013</w:t>
+              <w:t xml:space="preserve">−0.0012</w:t>
             </w:r>
           </w:p>
         </w:tc>
@@ -26316,7 +26286,7 @@
                 <w:sz w:val="17"/>
                 <w:szCs w:val="17"/>
               </w:rPr>
-              <w:t xml:space="preserve">0.1445</w:t>
+              <w:t xml:space="preserve">0.1442</w:t>
             </w:r>
           </w:p>
         </w:tc>
@@ -26341,7 +26311,7 @@
                 <w:sz w:val="17"/>
                 <w:szCs w:val="17"/>
               </w:rPr>
-              <w:t xml:space="preserve">48</w:t>
+              <w:t xml:space="preserve">49</w:t>
             </w:r>
           </w:p>
         </w:tc>
@@ -26396,7 +26366,7 @@
                 <w:sz w:val="17"/>
                 <w:szCs w:val="17"/>
               </w:rPr>
-              <w:t xml:space="preserve">61</w:t>
+              <w:t xml:space="preserve">60</w:t>
             </w:r>
           </w:p>
         </w:tc>
@@ -26421,7 +26391,7 @@
                 <w:sz w:val="17"/>
                 <w:szCs w:val="17"/>
               </w:rPr>
-              <w:t xml:space="preserve">-0.0008</w:t>
+              <w:t xml:space="preserve">−0.0008</w:t>
             </w:r>
           </w:p>
         </w:tc>
@@ -26446,7 +26416,7 @@
                 <w:sz w:val="17"/>
                 <w:szCs w:val="17"/>
               </w:rPr>
-              <w:t xml:space="preserve">0.1428</w:t>
+              <w:t xml:space="preserve">0.1431</w:t>
             </w:r>
           </w:p>
         </w:tc>
@@ -26567,7 +26537,7 @@
                 <w:sz w:val="17"/>
                 <w:szCs w:val="17"/>
               </w:rPr>
-              <w:t xml:space="preserve">-0.0013</w:t>
+              <w:t xml:space="preserve">−0.0013</w:t>
             </w:r>
           </w:p>
         </w:tc>
@@ -26697,7 +26667,7 @@
                 <w:sz w:val="17"/>
                 <w:szCs w:val="17"/>
               </w:rPr>
-              <w:t xml:space="preserve">-0.0027</w:t>
+              <w:t xml:space="preserve">−0.0027</w:t>
             </w:r>
           </w:p>
         </w:tc>
@@ -26824,7 +26794,7 @@
                 <w:sz w:val="17"/>
                 <w:szCs w:val="17"/>
               </w:rPr>
-              <w:t xml:space="preserve">-0.0028</w:t>
+              <w:t xml:space="preserve">−0.0028</w:t>
             </w:r>
           </w:p>
         </w:tc>
@@ -26967,6 +26937,7 @@
     </w:p>
     <w:p>
       <w:pPr>
+        <w:keepLines/>
         <w:spacing w:before="80" w:after="160"/>
         <w:jc w:val="both"/>
       </w:pPr>

</xml_diff>

<commit_message>
Second internal review: plateau runs, optimiser comparison, run-level statistics
</commit_message>
<xml_diff>
--- a/paper/docx/manuscript_long.docx
+++ b/paper/docx/manuscript_long.docx
@@ -35,7 +35,7 @@
           <w:szCs w:val="16"/>
           <w:vertAlign w:val="superscript"/>
         </w:rPr>
-        <w:t>1,*</w:t>
+        <w:t>1</w:t>
       </w:r>
       <w:r>
         <w:rPr>
@@ -65,7 +65,7 @@
           <w:szCs w:val="16"/>
           <w:vertAlign w:val="superscript"/>
         </w:rPr>
-        <w:t>1</w:t>
+        <w:t>1,*</w:t>
       </w:r>
     </w:p>
     <w:p>
@@ -103,7 +103,7 @@
           <w:sz w:val="19"/>
           <w:szCs w:val="19"/>
         </w:rPr>
-        <w:t>* Corresponding author: pushkal.gupta2023@vitstudent.ac.in</w:t>
+        <w:t>* Corresponding author: Kalaavathi B, kalaavathi.b@vit.ac.in</w:t>
       </w:r>
     </w:p>
     <w:p>
@@ -118,7 +118,7 @@
           <w:sz w:val="19"/>
           <w:szCs w:val="19"/>
         </w:rPr>
-        <w:t>E-mail addresses: vanka.kaushik2023@vitstudent.ac.in (V. Kaushik), kalaavathi.b@vit.ac.in (Kalaavathi B)</w:t>
+        <w:t>E-mail addresses: pushkal.gupta2023@vitstudent.ac.in (P. Gupta), vanka.kaushik2023@vitstudent.ac.in (V. Kaushik)</w:t>
       </w:r>
     </w:p>
     <w:p>
@@ -133,7 +133,7 @@
           <w:sz w:val="19"/>
           <w:szCs w:val="19"/>
         </w:rPr>
-        <w:t>ORCID: 0009-0004-7032-6847 (Pushkal Gupta)</w:t>
+        <w:t>ORCID: 0009-0004-7032-6847 (Pushkal Gupta), 0009-0003-0735-264X (Vanka Kaushik), 0000-0003-4027-3137 (Kalaavathi B)</w:t>
       </w:r>
     </w:p>
     <w:p>
@@ -161,7 +161,7 @@
           <w:sz w:val="22"/>
           <w:szCs w:val="22"/>
         </w:rPr>
-        <w:t xml:space="preserve">Federated learning (FL) is widely proposed for household load forecasting because smart-meter readings never leave the home. Its accuracy loss is usually blamed on differences between households, and its bandwidth advantage over collecting the data is usually assumed rather than measured. This study separated these effects under controlled conditions. One hundred standard-tariff London households from the Low Carbon London trial, one chronological test period, one long short-term memory (LSTM) forecaster and one training budget were held fixed, and a single factor was changed at a time: the number of clients the homes were split over, the heterogeneity between clients (dialled over real load-profile clusters and measured directly), client participation, the aggregation rule and the precision of the transmitted updates. Every byte exchanged was counted, and households were compared pairwise. Federated training on a single client matched centralised accuracy (mean absolute error 0.0808 against 0.0811 kWh). The gap grew with fragmentation, from 2.0 % with five clients to 10.3 % with one client per home. Heterogeneity at a fixed number of clients changed final error by at most 0.0012 kWh but raised the traffic needed to approach centralised accuracy by about 85 %, and federated training moved more bytes than uploading the raw readings. Plain federated averaging left 66 % of households worse off than local models; one epoch of local fine-tuning reduced this to 49 %. Operators and aggregators should therefore federate a few aggregated clients, fine-tune locally and treat federation as a governance choice rather than a bandwidth saving.</w:t>
+        <w:t xml:space="preserve">Federated learning (FL) is widely proposed for household load forecasting because smart-meter readings never leave the home. Its accuracy loss is usually blamed on differences between households, and its bandwidth advantage over collecting the data is usually assumed rather than measured. This study separated these effects under controlled conditions. One hundred standard-tariff London households from the Low Carbon London trial, one chronological test period, one long short-term memory (LSTM) forecaster and one training budget were held fixed, and a single factor was changed at a time: the number of clients the homes were split over, the heterogeneity between clients (dialled over real load-profile clusters and measured directly), client participation, the aggregation rule and the precision of the transmitted updates. Every byte exchanged was counted, and households were compared pairwise. Federated training on a single client matched centralised accuracy (mean absolute error 0.0809 against 0.0812 kWh). The gap grew with fragmentation, from 1.8 % with five clients to 10.0 % with one client per home. Heterogeneity at a fixed number of clients changed final error by at most 0.0012 kWh but raised the traffic needed to approach centralised accuracy by about 85 %, and federated training moved more bytes than uploading the raw readings. Plain federated averaging left 65 % of households worse off than local models; one epoch of local fine-tuning reduced this to 50 %. Operators and aggregators should therefore federate a few aggregated clients, fine-tune locally and treat federation as a governance choice rather than a bandwidth saving.</w:t>
       </w:r>
     </w:p>
     <w:p>
@@ -182,7 +182,7 @@
           <w:sz w:val="22"/>
           <w:szCs w:val="22"/>
         </w:rPr>
-        <w:t>smart meters; long short-term memory; non-IID data; communication efficiency; Low Carbon London; personalisation</w:t>
+        <w:t>federated learning; load forecasting; smart meters; non-IID data; communication efficiency; personalisation; Low Carbon London</w:t>
       </w:r>
     </w:p>
     <w:p>
@@ -282,7 +282,7 @@
           <w:sz w:val="22"/>
           <w:szCs w:val="22"/>
         </w:rPr>
-        <w:t xml:space="preserve">A controlled decomposition of the gap between federated and centralised training into the costs of the round protocol, of fragmentation, of heterogeneity and of partial participation. It shows that the gap is a fragmentation cost: absent on a single client and growing with the number of clients to 10.3 % when every home is a client.</w:t>
+        <w:t xml:space="preserve">A controlled decomposition of the gap between federated and centralised training into the costs of the round protocol, of fragmentation, of heterogeneity and of partial participation. It shows that the gap is a fragmentation cost: absent on a single client and growing with the number of clients to 10.0 % when every home is a client.</w:t>
       </w:r>
     </w:p>
     <w:p>
@@ -8317,7 +8317,7 @@
           <w:sz w:val="22"/>
           <w:szCs w:val="22"/>
         </w:rPr>
-        <w:t xml:space="preserve">Table 3 compares all arms on the 292,052 test half-hours. Every LSTM beat both naive references. Persistence (0.0890 kWh) was a much stronger baseline than seasonal naive (0.1332 kWh) at a 30-minute horizon. The centralised LSTM was the most accurate arm (MAE 0.0811 kWh) and was better than local-only training (0.0840 kWh) for 72 % of households (Holm-adjusted </w:t>
+        <w:t xml:space="preserve">Table 3 compares all arms on the 292,052 test half-hours. Every LSTM beat both naive references. Persistence (0.0890 kWh) was a much stronger baseline than seasonal naive (0.1332 kWh) at a 30-minute horizon. The centralised LSTM was the most accurate arm (MAE 0.0812 kWh) and was better than local-only training (0.0839 kWh) for 72 % of households (Holm-adjusted </w:t>
       </w:r>
       <m:oMath>
         <m:r>
@@ -8334,47 +8334,7 @@
           <w:sz w:val="22"/>
           <w:szCs w:val="22"/>
         </w:rPr>
-        <w:t xml:space="preserve"> </w:t>
-      </w:r>
-      <m:oMath>
-        <m:d>
-          <m:dPr>
-            <m:begChr m:val="&lt;"/>
-            <m:sepChr m:val=""/>
-            <m:endChr m:val=""/>
-          </m:dPr>
-          <m:e>
-            <m:sSup>
-              <m:e>
-                <m:r>
-                  <w:rPr>
-                    <w:rFonts w:ascii="Cambria Math" w:hAnsi="Cambria Math"/>
-                    <w:sz w:val="22"/>
-                    <w:szCs w:val="22"/>
-                  </w:rPr>
-                  <m:t>10</m:t>
-                </m:r>
-              </m:e>
-              <m:sup>
-                <m:r>
-                  <w:rPr>
-                    <w:rFonts w:ascii="Cambria Math" w:hAnsi="Cambria Math"/>
-                    <w:sz w:val="22"/>
-                    <w:szCs w:val="22"/>
-                  </w:rPr>
-                  <m:t>−4</m:t>
-                </m:r>
-              </m:sup>
-            </m:sSup>
-          </m:e>
-        </m:d>
-      </m:oMath>
-      <w:r>
-        <w:rPr>
-          <w:sz w:val="22"/>
-          <w:szCs w:val="22"/>
-        </w:rPr>
-        <w:t xml:space="preserve">).</w:t>
+        <w:t xml:space="preserve"> 0.0002).</w:t>
       </w:r>
     </w:p>
     <w:p>
@@ -9085,7 +9045,7 @@
                 <w:sz w:val="16"/>
                 <w:szCs w:val="16"/>
               </w:rPr>
-              <w:t xml:space="preserve">0.0840 </w:t>
+              <w:t xml:space="preserve">0.0839 </w:t>
             </w:r>
             <w:r>
               <w:rPr>
@@ -9124,7 +9084,7 @@
                 <w:sz w:val="16"/>
                 <w:szCs w:val="16"/>
               </w:rPr>
-              <w:t xml:space="preserve">0.1779 </w:t>
+              <w:t xml:space="preserve">0.1777 </w:t>
             </w:r>
             <w:r>
               <w:rPr>
@@ -9163,7 +9123,7 @@
                 <w:sz w:val="16"/>
                 <w:szCs w:val="16"/>
               </w:rPr>
-              <w:t xml:space="preserve">37.3 </w:t>
+              <w:t xml:space="preserve">37.2 </w:t>
             </w:r>
             <w:r>
               <w:rPr>
@@ -9177,7 +9137,7 @@
                 <w:sz w:val="16"/>
                 <w:szCs w:val="16"/>
               </w:rPr>
-              <w:t xml:space="preserve"> 0.4</w:t>
+              <w:t xml:space="preserve"> 0.3</w:t>
             </w:r>
           </w:p>
         </w:tc>
@@ -9307,7 +9267,7 @@
                 <w:sz w:val="16"/>
                 <w:szCs w:val="16"/>
               </w:rPr>
-              <w:t xml:space="preserve">0.0811 </w:t>
+              <w:t xml:space="preserve">0.0812 </w:t>
             </w:r>
             <w:r>
               <w:rPr>
@@ -9321,7 +9281,7 @@
                 <w:sz w:val="16"/>
                 <w:szCs w:val="16"/>
               </w:rPr>
-              <w:t xml:space="preserve"> 0.0003</w:t>
+              <w:t xml:space="preserve"> 0.0004</w:t>
             </w:r>
           </w:p>
         </w:tc>
@@ -9346,7 +9306,7 @@
                 <w:sz w:val="16"/>
                 <w:szCs w:val="16"/>
               </w:rPr>
-              <w:t xml:space="preserve">0.1718 </w:t>
+              <w:t xml:space="preserve">0.1721 </w:t>
             </w:r>
             <w:r>
               <w:rPr>
@@ -9360,7 +9320,7 @@
                 <w:sz w:val="16"/>
                 <w:szCs w:val="16"/>
               </w:rPr>
-              <w:t xml:space="preserve"> 0.0015</w:t>
+              <w:t xml:space="preserve"> 0.0013</w:t>
             </w:r>
           </w:p>
         </w:tc>
@@ -9385,7 +9345,7 @@
                 <w:sz w:val="16"/>
                 <w:szCs w:val="16"/>
               </w:rPr>
-              <w:t xml:space="preserve">36.7 </w:t>
+              <w:t xml:space="preserve">36.5 </w:t>
             </w:r>
             <w:r>
               <w:rPr>
@@ -10005,7 +9965,7 @@
                 <w:sz w:val="16"/>
                 <w:szCs w:val="16"/>
               </w:rPr>
-              <w:t xml:space="preserve">0.0858 </w:t>
+              <w:t xml:space="preserve">0.0857 </w:t>
             </w:r>
             <w:r>
               <w:rPr>
@@ -10019,7 +9979,7 @@
                 <w:sz w:val="16"/>
                 <w:szCs w:val="16"/>
               </w:rPr>
-              <w:t xml:space="preserve"> 0.0001</w:t>
+              <w:t xml:space="preserve"> 0.0002</w:t>
             </w:r>
           </w:p>
         </w:tc>
@@ -10044,7 +10004,7 @@
                 <w:sz w:val="16"/>
                 <w:szCs w:val="16"/>
               </w:rPr>
-              <w:t xml:space="preserve">0.1755 </w:t>
+              <w:t xml:space="preserve">0.1759 </w:t>
             </w:r>
             <w:r>
               <w:rPr>
@@ -10058,7 +10018,7 @@
                 <w:sz w:val="16"/>
                 <w:szCs w:val="16"/>
               </w:rPr>
-              <w:t xml:space="preserve"> 0.0006</w:t>
+              <w:t xml:space="preserve"> 0.0009</w:t>
             </w:r>
           </w:p>
         </w:tc>
@@ -10083,7 +10043,7 @@
                 <w:sz w:val="16"/>
                 <w:szCs w:val="16"/>
               </w:rPr>
-              <w:t xml:space="preserve">39.5 </w:t>
+              <w:t xml:space="preserve">39.3 </w:t>
             </w:r>
             <w:r>
               <w:rPr>
@@ -10097,7 +10057,7 @@
                 <w:sz w:val="16"/>
                 <w:szCs w:val="16"/>
               </w:rPr>
-              <w:t xml:space="preserve"> 0.1</w:t>
+              <w:t xml:space="preserve"> 0.4</w:t>
             </w:r>
           </w:p>
         </w:tc>
@@ -10147,7 +10107,7 @@
                 <w:sz w:val="16"/>
                 <w:szCs w:val="16"/>
               </w:rPr>
-              <w:t xml:space="preserve">26.0 / 30</w:t>
+              <w:t xml:space="preserve">22.8 / 30</w:t>
             </w:r>
           </w:p>
         </w:tc>
@@ -10909,7 +10869,7 @@
                 <w:sz w:val="16"/>
                 <w:szCs w:val="16"/>
               </w:rPr>
-              <w:t xml:space="preserve">0.0865 </w:t>
+              <w:t xml:space="preserve">0.0862 </w:t>
             </w:r>
             <w:r>
               <w:rPr>
@@ -10923,7 +10883,7 @@
                 <w:sz w:val="16"/>
                 <w:szCs w:val="16"/>
               </w:rPr>
-              <w:t xml:space="preserve"> 0.0002</w:t>
+              <w:t xml:space="preserve"> 0.0004</w:t>
             </w:r>
           </w:p>
         </w:tc>
@@ -10948,7 +10908,7 @@
                 <w:sz w:val="16"/>
                 <w:szCs w:val="16"/>
               </w:rPr>
-              <w:t xml:space="preserve">0.1772 </w:t>
+              <w:t xml:space="preserve">0.1768 </w:t>
             </w:r>
             <w:r>
               <w:rPr>
@@ -10987,7 +10947,7 @@
                 <w:sz w:val="16"/>
                 <w:szCs w:val="16"/>
               </w:rPr>
-              <w:t xml:space="preserve">39.5 </w:t>
+              <w:t xml:space="preserve">39.4 </w:t>
             </w:r>
             <w:r>
               <w:rPr>
@@ -11026,7 +10986,7 @@
                 <w:sz w:val="16"/>
                 <w:szCs w:val="16"/>
               </w:rPr>
-              <w:t xml:space="preserve">36.6</w:t>
+              <w:t xml:space="preserve">36.5</w:t>
             </w:r>
           </w:p>
         </w:tc>
@@ -11051,7 +11011,7 @@
                 <w:sz w:val="16"/>
                 <w:szCs w:val="16"/>
               </w:rPr>
-              <w:t xml:space="preserve">15.7 / 30</w:t>
+              <w:t xml:space="preserve">18.0 / 30</w:t>
             </w:r>
           </w:p>
         </w:tc>
@@ -12083,7 +12043,7 @@
                 <w:sz w:val="16"/>
                 <w:szCs w:val="16"/>
               </w:rPr>
-              <w:t xml:space="preserve">0.0894 </w:t>
+              <w:t xml:space="preserve">0.0893 </w:t>
             </w:r>
             <w:r>
               <w:rPr>
@@ -12097,7 +12057,7 @@
                 <w:sz w:val="16"/>
                 <w:szCs w:val="16"/>
               </w:rPr>
-              <w:t xml:space="preserve"> 0.0013</w:t>
+              <w:t xml:space="preserve"> 0.0009</w:t>
             </w:r>
           </w:p>
         </w:tc>
@@ -12122,7 +12082,7 @@
                 <w:sz w:val="16"/>
                 <w:szCs w:val="16"/>
               </w:rPr>
-              <w:t xml:space="preserve">0.1816 </w:t>
+              <w:t xml:space="preserve">0.1810 </w:t>
             </w:r>
             <w:r>
               <w:rPr>
@@ -12175,7 +12135,7 @@
                 <w:sz w:val="16"/>
                 <w:szCs w:val="16"/>
               </w:rPr>
-              <w:t xml:space="preserve"> 1.5</w:t>
+              <w:t xml:space="preserve"> 1.1</w:t>
             </w:r>
           </w:p>
         </w:tc>
@@ -12225,7 +12185,7 @@
                 <w:sz w:val="16"/>
                 <w:szCs w:val="16"/>
               </w:rPr>
-              <w:t xml:space="preserve">29.0 / 30</w:t>
+              <w:t xml:space="preserve">29.2 / 30</w:t>
             </w:r>
           </w:p>
         </w:tc>
@@ -12749,7 +12709,7 @@
                 <w:sz w:val="16"/>
                 <w:szCs w:val="16"/>
               </w:rPr>
-              <w:t xml:space="preserve">0.0808 </w:t>
+              <w:t xml:space="preserve">0.0809 </w:t>
             </w:r>
             <w:r>
               <w:rPr>
@@ -12763,32 +12723,71 @@
                 <w:sz w:val="16"/>
                 <w:szCs w:val="16"/>
               </w:rPr>
+              <w:t xml:space="preserve"> 0.0004</w:t>
+            </w:r>
+          </w:p>
+        </w:tc>
+        <w:tc>
+          <w:tcPr>
+            <w:tcW w:w="1415" w:type="dxa"/>
+            <w:tcMar>
+              <w:top w:w="40" w:type="dxa"/>
+              <w:left w:w="80" w:type="dxa"/>
+              <w:bottom w:w="40" w:type="dxa"/>
+              <w:right w:w="80" w:type="dxa"/>
+            </w:tcMar>
+          </w:tcPr>
+          <w:p>
+            <w:pPr>
+              <w:keepNext/>
+              <w:spacing w:before="0" w:after="0" w:line="240" w:lineRule="auto"/>
+              <w:jc w:val="right"/>
+            </w:pPr>
+            <w:r>
+              <w:rPr>
+                <w:sz w:val="16"/>
+                <w:szCs w:val="16"/>
+              </w:rPr>
+              <w:t xml:space="preserve">0.1709 </w:t>
+            </w:r>
+            <w:r>
+              <w:rPr>
+                <w:sz w:val="16"/>
+                <w:szCs w:val="16"/>
+              </w:rPr>
+              <w:t xml:space="preserve">±</w:t>
+            </w:r>
+            <w:r>
+              <w:rPr>
+                <w:sz w:val="16"/>
+                <w:szCs w:val="16"/>
+              </w:rPr>
               <w:t xml:space="preserve"> 0.0005</w:t>
             </w:r>
           </w:p>
         </w:tc>
         <w:tc>
           <w:tcPr>
-            <w:tcW w:w="1415" w:type="dxa"/>
-            <w:tcMar>
-              <w:top w:w="40" w:type="dxa"/>
-              <w:left w:w="80" w:type="dxa"/>
-              <w:bottom w:w="40" w:type="dxa"/>
-              <w:right w:w="80" w:type="dxa"/>
-            </w:tcMar>
-          </w:tcPr>
-          <w:p>
-            <w:pPr>
-              <w:keepNext/>
-              <w:spacing w:before="0" w:after="0" w:line="240" w:lineRule="auto"/>
-              <w:jc w:val="right"/>
-            </w:pPr>
-            <w:r>
-              <w:rPr>
-                <w:sz w:val="16"/>
-                <w:szCs w:val="16"/>
-              </w:rPr>
-              <w:t xml:space="preserve">0.1710 </w:t>
+            <w:tcW w:w="973" w:type="dxa"/>
+            <w:tcMar>
+              <w:top w:w="40" w:type="dxa"/>
+              <w:left w:w="80" w:type="dxa"/>
+              <w:bottom w:w="40" w:type="dxa"/>
+              <w:right w:w="80" w:type="dxa"/>
+            </w:tcMar>
+          </w:tcPr>
+          <w:p>
+            <w:pPr>
+              <w:keepNext/>
+              <w:spacing w:before="0" w:after="0" w:line="240" w:lineRule="auto"/>
+              <w:jc w:val="right"/>
+            </w:pPr>
+            <w:r>
+              <w:rPr>
+                <w:sz w:val="16"/>
+                <w:szCs w:val="16"/>
+              </w:rPr>
+              <w:t xml:space="preserve">36.8 </w:t>
             </w:r>
             <w:r>
               <w:rPr>
@@ -12802,7 +12801,32 @@
                 <w:sz w:val="16"/>
                 <w:szCs w:val="16"/>
               </w:rPr>
-              <w:t xml:space="preserve"> 0.0003</w:t>
+              <w:t xml:space="preserve"> 0.3</w:t>
+            </w:r>
+          </w:p>
+        </w:tc>
+        <w:tc>
+          <w:tcPr>
+            <w:tcW w:w="619" w:type="dxa"/>
+            <w:tcMar>
+              <w:top w:w="40" w:type="dxa"/>
+              <w:left w:w="80" w:type="dxa"/>
+              <w:bottom w:w="40" w:type="dxa"/>
+              <w:right w:w="80" w:type="dxa"/>
+            </w:tcMar>
+          </w:tcPr>
+          <w:p>
+            <w:pPr>
+              <w:keepNext/>
+              <w:spacing w:before="0" w:after="0" w:line="240" w:lineRule="auto"/>
+              <w:jc w:val="right"/>
+            </w:pPr>
+            <w:r>
+              <w:rPr>
+                <w:sz w:val="16"/>
+                <w:szCs w:val="16"/>
+              </w:rPr>
+              <w:t xml:space="preserve">34.2</w:t>
             </w:r>
           </w:p>
         </w:tc>
@@ -12827,71 +12851,7 @@
                 <w:sz w:val="16"/>
                 <w:szCs w:val="16"/>
               </w:rPr>
-              <w:t xml:space="preserve">36.7 </w:t>
-            </w:r>
-            <w:r>
-              <w:rPr>
-                <w:sz w:val="16"/>
-                <w:szCs w:val="16"/>
-              </w:rPr>
-              <w:t xml:space="preserve">±</w:t>
-            </w:r>
-            <w:r>
-              <w:rPr>
-                <w:sz w:val="16"/>
-                <w:szCs w:val="16"/>
-              </w:rPr>
-              <w:t xml:space="preserve"> 0.3</w:t>
-            </w:r>
-          </w:p>
-        </w:tc>
-        <w:tc>
-          <w:tcPr>
-            <w:tcW w:w="619" w:type="dxa"/>
-            <w:tcMar>
-              <w:top w:w="40" w:type="dxa"/>
-              <w:left w:w="80" w:type="dxa"/>
-              <w:bottom w:w="40" w:type="dxa"/>
-              <w:right w:w="80" w:type="dxa"/>
-            </w:tcMar>
-          </w:tcPr>
-          <w:p>
-            <w:pPr>
-              <w:keepNext/>
-              <w:spacing w:before="0" w:after="0" w:line="240" w:lineRule="auto"/>
-              <w:jc w:val="right"/>
-            </w:pPr>
-            <w:r>
-              <w:rPr>
-                <w:sz w:val="16"/>
-                <w:szCs w:val="16"/>
-              </w:rPr>
-              <w:t xml:space="preserve">34.2</w:t>
-            </w:r>
-          </w:p>
-        </w:tc>
-        <w:tc>
-          <w:tcPr>
-            <w:tcW w:w="973" w:type="dxa"/>
-            <w:tcMar>
-              <w:top w:w="40" w:type="dxa"/>
-              <w:left w:w="80" w:type="dxa"/>
-              <w:bottom w:w="40" w:type="dxa"/>
-              <w:right w:w="80" w:type="dxa"/>
-            </w:tcMar>
-          </w:tcPr>
-          <w:p>
-            <w:pPr>
-              <w:keepNext/>
-              <w:spacing w:before="0" w:after="0" w:line="240" w:lineRule="auto"/>
-              <w:jc w:val="right"/>
-            </w:pPr>
-            <w:r>
-              <w:rPr>
-                <w:sz w:val="16"/>
-                <w:szCs w:val="16"/>
-              </w:rPr>
-              <w:t xml:space="preserve">16.3 / 30</w:t>
+              <w:t xml:space="preserve">18.6 / 30</w:t>
             </w:r>
           </w:p>
         </w:tc>
@@ -12971,7 +12931,7 @@
                 <w:sz w:val="16"/>
                 <w:szCs w:val="16"/>
               </w:rPr>
-              <w:t xml:space="preserve">0.0827 </w:t>
+              <w:t xml:space="preserve">0.0826 </w:t>
             </w:r>
             <w:r>
               <w:rPr>
@@ -13024,7 +12984,7 @@
                 <w:sz w:val="16"/>
                 <w:szCs w:val="16"/>
               </w:rPr>
-              <w:t xml:space="preserve"> 0.0006</w:t>
+              <w:t xml:space="preserve"> 0.0005</w:t>
             </w:r>
           </w:p>
         </w:tc>
@@ -13049,7 +13009,7 @@
                 <w:sz w:val="16"/>
                 <w:szCs w:val="16"/>
               </w:rPr>
-              <w:t xml:space="preserve">38.1 </w:t>
+              <w:t xml:space="preserve">38.0 </w:t>
             </w:r>
             <w:r>
               <w:rPr>
@@ -13063,7 +13023,7 @@
                 <w:sz w:val="16"/>
                 <w:szCs w:val="16"/>
               </w:rPr>
-              <w:t xml:space="preserve"> 0.2</w:t>
+              <w:t xml:space="preserve"> 0.3</w:t>
             </w:r>
           </w:p>
         </w:tc>
@@ -13113,7 +13073,7 @@
                 <w:sz w:val="16"/>
                 <w:szCs w:val="16"/>
               </w:rPr>
-              <w:t xml:space="preserve">23.0 / 30</w:t>
+              <w:t xml:space="preserve">21.8 / 30</w:t>
             </w:r>
           </w:p>
         </w:tc>
@@ -13191,7 +13151,7 @@
                 <w:sz w:val="16"/>
                 <w:szCs w:val="16"/>
               </w:rPr>
-              <w:t xml:space="preserve">0.0869 </w:t>
+              <w:t xml:space="preserve">0.0870 </w:t>
             </w:r>
             <w:r>
               <w:rPr>
@@ -13205,7 +13165,7 @@
                 <w:sz w:val="16"/>
                 <w:szCs w:val="16"/>
               </w:rPr>
-              <w:t xml:space="preserve"> 0.0006</w:t>
+              <w:t xml:space="preserve"> 0.0005</w:t>
             </w:r>
           </w:p>
         </w:tc>
@@ -13229,7 +13189,7 @@
                 <w:sz w:val="16"/>
                 <w:szCs w:val="16"/>
               </w:rPr>
-              <w:t xml:space="preserve">0.1782 </w:t>
+              <w:t xml:space="preserve">0.1780 </w:t>
             </w:r>
             <w:r>
               <w:rPr>
@@ -13267,7 +13227,7 @@
                 <w:sz w:val="16"/>
                 <w:szCs w:val="16"/>
               </w:rPr>
-              <w:t xml:space="preserve">39.6 </w:t>
+              <w:t xml:space="preserve">39.8 </w:t>
             </w:r>
             <w:r>
               <w:rPr>
@@ -13329,7 +13289,7 @@
                 <w:sz w:val="16"/>
                 <w:szCs w:val="16"/>
               </w:rPr>
-              <w:t xml:space="preserve">26.7 / 30</w:t>
+              <w:t xml:space="preserve">26.6 / 30</w:t>
             </w:r>
           </w:p>
         </w:tc>
@@ -13374,7 +13334,7 @@
           <w:sz w:val="22"/>
           <w:szCs w:val="22"/>
         </w:rPr>
-        <w:t xml:space="preserve">FedAvg with random grouping reached 0.0854 kWh, 5.3 % above centralised, and was worse than centralised for every household. Under moderate heterogeneity (</w:t>
+        <w:t xml:space="preserve">FedAvg with random grouping reached 0.0854 kWh, 5.2 % above centralised, and was worse than centralised for every household. Under moderate heterogeneity (</w:t>
       </w:r>
       <m:oMath>
         <m:r>
@@ -13391,7 +13351,7 @@
           <w:sz w:val="22"/>
           <w:szCs w:val="22"/>
         </w:rPr>
-        <w:t xml:space="preserve">) FedAvg reached 0.0860 kWh and was worse than local-only training on pooled MAE; per household it beat local-only for only 34 % of homes (</w:t>
+        <w:t xml:space="preserve">) FedAvg reached 0.0860 kWh and was worse than local-only training on pooled MAE; per household it beat local-only for only 35 % of homes (</w:t>
       </w:r>
       <m:oMath>
         <m:sSub>
@@ -13425,7 +13385,7 @@
           <w:sz w:val="22"/>
           <w:szCs w:val="22"/>
         </w:rPr>
-        <w:t xml:space="preserve"> 0.0047). On RMSE the ordering reversed: FedAvg (0.1757 kWh) beat local-only (0.1779 kWh). Fig. 2 shows the first three test days of the household whose mean load is closest to the cohort median. All learned models tracked the daily pattern and lagged sharp, short spikes by one step, and the differences between arms were small relative to the volatility of the series.</w:t>
+        <w:t xml:space="preserve"> 0.0029). On RMSE the ordering reversed: FedAvg (0.1757 kWh) beat local-only (0.1777 kWh). Fig. 2 shows the first three test days of the household whose mean load is closest to the cohort median. All learned models tracked the daily pattern and lagged sharp, short spikes by one step, and the differences between arms were small relative to the volatility of the series.</w:t>
       </w:r>
     </w:p>
     <w:p>
@@ -13543,7 +13503,7 @@
           <w:sz w:val="22"/>
           <w:szCs w:val="22"/>
         </w:rPr>
-        <w:t xml:space="preserve">) reproduced centralised accuracy: 0.0808 kWh against 0.0811 kWh, with no significant per-household difference (52 % of homes better, </w:t>
+        <w:t xml:space="preserve">) reproduced centralised accuracy: 0.0809 kWh against 0.0812 kWh, with no significant per-household difference (49 % of homes better, </w:t>
       </w:r>
       <m:oMath>
         <m:sSub>
@@ -13577,7 +13537,7 @@
           <w:sz w:val="22"/>
           <w:szCs w:val="22"/>
         </w:rPr>
-        <w:t xml:space="preserve"> 0.2092). The gap appeared as soon as the same data were split and grew steadily with the number of clients, from 2.0 % at </w:t>
+        <w:t xml:space="preserve"> 0.6645). The gap appeared as soon as the same data were split and grew steadily with the number of clients, from 1.8 % at </w:t>
       </w:r>
       <m:oMath>
         <m:r>
@@ -13594,7 +13554,7 @@
           <w:sz w:val="22"/>
           <w:szCs w:val="22"/>
         </w:rPr>
-        <w:t xml:space="preserve"> through 5.3 % at </w:t>
+        <w:t xml:space="preserve"> through 5.2 % at </w:t>
       </w:r>
       <m:oMath>
         <m:r>
@@ -13628,7 +13588,7 @@
           <w:sz w:val="22"/>
           <w:szCs w:val="22"/>
         </w:rPr>
-        <w:t xml:space="preserve"> to 10.3 % when every household was its own client. At </w:t>
+        <w:t xml:space="preserve"> to 10.0 % when every household was its own client. At </w:t>
       </w:r>
       <m:oMath>
         <m:r>
@@ -13645,7 +13605,7 @@
           <w:sz w:val="22"/>
           <w:szCs w:val="22"/>
         </w:rPr>
-        <w:t xml:space="preserve">, FedAvg with random grouping was worse than the single-client run for 99 % of households.</w:t>
+        <w:t xml:space="preserve">, FedAvg with random grouping was worse than the single-client run for 98 % of households.</w:t>
       </w:r>
     </w:p>
     <w:p>
@@ -13905,7 +13865,7 @@
                 <w:sz w:val="19"/>
                 <w:szCs w:val="19"/>
               </w:rPr>
-              <w:t xml:space="preserve">0.0811 </w:t>
+              <w:t xml:space="preserve">0.0812 </w:t>
             </w:r>
             <w:r>
               <w:rPr>
@@ -13919,7 +13879,7 @@
                 <w:sz w:val="19"/>
                 <w:szCs w:val="19"/>
               </w:rPr>
-              <w:t xml:space="preserve"> 0.0003</w:t>
+              <w:t xml:space="preserve"> 0.0004</w:t>
             </w:r>
           </w:p>
         </w:tc>
@@ -14024,7 +13984,7 @@
                 <w:sz w:val="19"/>
                 <w:szCs w:val="19"/>
               </w:rPr>
-              <w:t xml:space="preserve">0.0808 </w:t>
+              <w:t xml:space="preserve">0.0809 </w:t>
             </w:r>
             <w:r>
               <w:rPr>
@@ -14038,7 +13998,7 @@
                 <w:sz w:val="19"/>
                 <w:szCs w:val="19"/>
               </w:rPr>
-              <w:t xml:space="preserve"> 0.0005</w:t>
+              <w:t xml:space="preserve"> 0.0004</w:t>
             </w:r>
           </w:p>
         </w:tc>
@@ -14063,7 +14023,7 @@
                 <w:sz w:val="19"/>
                 <w:szCs w:val="19"/>
               </w:rPr>
-              <w:t xml:space="preserve">−0.0002</w:t>
+              <w:t xml:space="preserve">−0.0003</w:t>
             </w:r>
           </w:p>
         </w:tc>
@@ -14088,7 +14048,7 @@
                 <w:sz w:val="19"/>
                 <w:szCs w:val="19"/>
               </w:rPr>
-              <w:t xml:space="preserve">−0.3</w:t>
+              <w:t xml:space="preserve">−0.4</w:t>
             </w:r>
           </w:p>
         </w:tc>
@@ -14182,7 +14142,7 @@
                 <w:sz w:val="19"/>
                 <w:szCs w:val="19"/>
               </w:rPr>
-              <w:t xml:space="preserve">+0.0046</w:t>
+              <w:t xml:space="preserve">+0.0045</w:t>
             </w:r>
           </w:p>
         </w:tc>
@@ -14207,7 +14167,7 @@
                 <w:sz w:val="19"/>
                 <w:szCs w:val="19"/>
               </w:rPr>
-              <w:t xml:space="preserve">+5.3</w:t>
+              <w:t xml:space="preserve">+5.2</w:t>
             </w:r>
           </w:p>
         </w:tc>
@@ -14342,7 +14302,7 @@
                 <w:sz w:val="19"/>
                 <w:szCs w:val="19"/>
               </w:rPr>
-              <w:t xml:space="preserve">+6.0</w:t>
+              <w:t xml:space="preserve">+5.9</w:t>
             </w:r>
           </w:p>
         </w:tc>
@@ -14461,7 +14421,7 @@
                 <w:sz w:val="19"/>
                 <w:szCs w:val="19"/>
               </w:rPr>
-              <w:t xml:space="preserve">+4.9</w:t>
+              <w:t xml:space="preserve">+4.7</w:t>
             </w:r>
           </w:p>
         </w:tc>
@@ -14580,7 +14540,7 @@
                 <w:sz w:val="19"/>
                 <w:szCs w:val="19"/>
               </w:rPr>
-              <w:t xml:space="preserve">+5.7</w:t>
+              <w:t xml:space="preserve">+5.5</w:t>
             </w:r>
           </w:p>
         </w:tc>
@@ -14633,7 +14593,7 @@
                 <w:sz w:val="19"/>
                 <w:szCs w:val="19"/>
               </w:rPr>
-              <w:t xml:space="preserve">0.0894 </w:t>
+              <w:t xml:space="preserve">0.0893 </w:t>
             </w:r>
             <w:r>
               <w:rPr>
@@ -14647,7 +14607,7 @@
                 <w:sz w:val="19"/>
                 <w:szCs w:val="19"/>
               </w:rPr>
-              <w:t xml:space="preserve"> 0.0013</w:t>
+              <w:t xml:space="preserve"> 0.0009</w:t>
             </w:r>
           </w:p>
         </w:tc>
@@ -14695,7 +14655,7 @@
                 <w:sz w:val="19"/>
                 <w:szCs w:val="19"/>
               </w:rPr>
-              <w:t xml:space="preserve">+10.3</w:t>
+              <w:t xml:space="preserve">+10.0</w:t>
             </w:r>
           </w:p>
         </w:tc>
@@ -15137,7 +15097,7 @@
                 <w:sz w:val="16"/>
                 <w:szCs w:val="16"/>
               </w:rPr>
-              <w:t xml:space="preserve">0.0808 </w:t>
+              <w:t xml:space="preserve">0.0809 </w:t>
             </w:r>
             <w:r>
               <w:rPr>
@@ -15151,7 +15111,7 @@
                 <w:sz w:val="16"/>
                 <w:szCs w:val="16"/>
               </w:rPr>
-              <w:t xml:space="preserve"> 0.0005</w:t>
+              <w:t xml:space="preserve"> 0.0004</w:t>
             </w:r>
           </w:p>
         </w:tc>
@@ -15176,7 +15136,7 @@
                 <w:sz w:val="16"/>
                 <w:szCs w:val="16"/>
               </w:rPr>
-              <w:t xml:space="preserve">0.0812</w:t>
+              <w:t xml:space="preserve">0.0811</w:t>
             </w:r>
           </w:p>
         </w:tc>
@@ -15226,7 +15186,7 @@
                 <w:sz w:val="16"/>
                 <w:szCs w:val="16"/>
               </w:rPr>
-              <w:t xml:space="preserve">−0.3</w:t>
+              <w:t xml:space="preserve">−0.4</w:t>
             </w:r>
           </w:p>
         </w:tc>
@@ -15306,7 +15266,7 @@
                 <w:sz w:val="16"/>
                 <w:szCs w:val="16"/>
               </w:rPr>
-              <w:t xml:space="preserve">0.0028</w:t>
+              <w:t xml:space="preserve">0.0026</w:t>
             </w:r>
           </w:p>
         </w:tc>
@@ -15331,7 +15291,7 @@
                 <w:sz w:val="16"/>
                 <w:szCs w:val="16"/>
               </w:rPr>
-              <w:t xml:space="preserve">0.0827 </w:t>
+              <w:t xml:space="preserve">0.0826 </w:t>
             </w:r>
             <w:r>
               <w:rPr>
@@ -15395,7 +15355,7 @@
                 <w:sz w:val="16"/>
                 <w:szCs w:val="16"/>
               </w:rPr>
-              <w:t xml:space="preserve">0.759</w:t>
+              <w:t xml:space="preserve">0.756</w:t>
             </w:r>
           </w:p>
         </w:tc>
@@ -15420,7 +15380,7 @@
                 <w:sz w:val="16"/>
                 <w:szCs w:val="16"/>
               </w:rPr>
-              <w:t xml:space="preserve">+2.0</w:t>
+              <w:t xml:space="preserve">+1.8</w:t>
             </w:r>
           </w:p>
         </w:tc>
@@ -15614,7 +15574,7 @@
                 <w:sz w:val="16"/>
                 <w:szCs w:val="16"/>
               </w:rPr>
-              <w:t xml:space="preserve">+5.3</w:t>
+              <w:t xml:space="preserve">+5.2</w:t>
             </w:r>
           </w:p>
         </w:tc>
@@ -15694,7 +15654,7 @@
                 <w:sz w:val="16"/>
                 <w:szCs w:val="16"/>
               </w:rPr>
-              <w:t xml:space="preserve">0.0261</w:t>
+              <w:t xml:space="preserve">0.0263</w:t>
             </w:r>
           </w:p>
         </w:tc>
@@ -15719,7 +15679,7 @@
                 <w:sz w:val="16"/>
                 <w:szCs w:val="16"/>
               </w:rPr>
-              <w:t xml:space="preserve">0.0869 </w:t>
+              <w:t xml:space="preserve">0.0870 </w:t>
             </w:r>
             <w:r>
               <w:rPr>
@@ -15733,7 +15693,7 @@
                 <w:sz w:val="16"/>
                 <w:szCs w:val="16"/>
               </w:rPr>
-              <w:t xml:space="preserve"> 0.0006</w:t>
+              <w:t xml:space="preserve"> 0.0005</w:t>
             </w:r>
           </w:p>
         </w:tc>
@@ -15758,7 +15718,7 @@
                 <w:sz w:val="16"/>
                 <w:szCs w:val="16"/>
               </w:rPr>
-              <w:t xml:space="preserve">0.0842</w:t>
+              <w:t xml:space="preserve">0.0841</w:t>
             </w:r>
           </w:p>
         </w:tc>
@@ -15783,7 +15743,7 @@
                 <w:sz w:val="16"/>
                 <w:szCs w:val="16"/>
               </w:rPr>
-              <w:t xml:space="preserve">0.884</w:t>
+              <w:t xml:space="preserve">0.883</w:t>
             </w:r>
           </w:p>
         </w:tc>
@@ -15909,7 +15869,7 @@
                 <w:sz w:val="16"/>
                 <w:szCs w:val="16"/>
               </w:rPr>
-              <w:t xml:space="preserve">0.0894 </w:t>
+              <w:t xml:space="preserve">0.0893 </w:t>
             </w:r>
             <w:r>
               <w:rPr>
@@ -15923,7 +15883,7 @@
                 <w:sz w:val="16"/>
                 <w:szCs w:val="16"/>
               </w:rPr>
-              <w:t xml:space="preserve"> 0.0013</w:t>
+              <w:t xml:space="preserve"> 0.0009</w:t>
             </w:r>
           </w:p>
         </w:tc>
@@ -15947,7 +15907,7 @@
                 <w:sz w:val="16"/>
                 <w:szCs w:val="16"/>
               </w:rPr>
-              <w:t xml:space="preserve">0.0851</w:t>
+              <w:t xml:space="preserve">0.0849</w:t>
             </w:r>
           </w:p>
         </w:tc>
@@ -15971,7 +15931,7 @@
                 <w:sz w:val="16"/>
                 <w:szCs w:val="16"/>
               </w:rPr>
-              <w:t xml:space="preserve">0.890</w:t>
+              <w:t xml:space="preserve">0.888</w:t>
             </w:r>
           </w:p>
         </w:tc>
@@ -15995,7 +15955,7 @@
                 <w:sz w:val="16"/>
                 <w:szCs w:val="16"/>
               </w:rPr>
-              <w:t xml:space="preserve">+10.3</w:t>
+              <w:t xml:space="preserve">+10.0</w:t>
             </w:r>
           </w:p>
         </w:tc>
@@ -16192,7 +16152,7 @@
             <w:sz w:val="22"/>
             <w:szCs w:val="22"/>
           </w:rPr>
-          <m:t>n=34</m:t>
+          <m:t>n=40</m:t>
         </m:r>
       </m:oMath>
       <w:r>
@@ -16231,7 +16191,7 @@
             <w:sz w:val="22"/>
             <w:szCs w:val="22"/>
           </w:rPr>
-          <m:t>=0.86</m:t>
+          <m:t>=0.90</m:t>
         </m:r>
       </m:oMath>
       <w:r>
@@ -16276,7 +16236,7 @@
             <w:sz w:val="22"/>
             <w:szCs w:val="22"/>
           </w:rPr>
-          <m:t>1.45×</m:t>
+          <m:t>1.53×</m:t>
         </m:r>
         <m:sSup>
           <m:e>
@@ -16323,7 +16283,47 @@
           <w:sz w:val="22"/>
           <w:szCs w:val="22"/>
         </w:rPr>
-        <w:t xml:space="preserve"> 0.0004), while the heterogeneity term was not significant (</w:t>
+        <w:t xml:space="preserve"> </w:t>
+      </w:r>
+      <m:oMath>
+        <m:d>
+          <m:dPr>
+            <m:begChr m:val="&lt;"/>
+            <m:sepChr m:val=""/>
+            <m:endChr m:val=""/>
+          </m:dPr>
+          <m:e>
+            <m:sSup>
+              <m:e>
+                <m:r>
+                  <w:rPr>
+                    <w:rFonts w:ascii="Cambria Math" w:hAnsi="Cambria Math"/>
+                    <w:sz w:val="22"/>
+                    <w:szCs w:val="22"/>
+                  </w:rPr>
+                  <m:t>10</m:t>
+                </m:r>
+              </m:e>
+              <m:sup>
+                <m:r>
+                  <w:rPr>
+                    <w:rFonts w:ascii="Cambria Math" w:hAnsi="Cambria Math"/>
+                    <w:sz w:val="22"/>
+                    <w:szCs w:val="22"/>
+                  </w:rPr>
+                  <m:t>−4</m:t>
+                </m:r>
+              </m:sup>
+            </m:sSup>
+          </m:e>
+        </m:d>
+      </m:oMath>
+      <w:r>
+        <w:rPr>
+          <w:sz w:val="22"/>
+          <w:szCs w:val="22"/>
+        </w:rPr>
+        <w:t xml:space="preserve">), while the heterogeneity term was not significant (</w:t>
       </w:r>
       <m:oMath>
         <m:r>
@@ -16340,7 +16340,7 @@
           <w:sz w:val="22"/>
           <w:szCs w:val="22"/>
         </w:rPr>
-        <w:t xml:space="preserve"> 0.0449). Within </w:t>
+        <w:t xml:space="preserve"> 0.0349). Within </w:t>
       </w:r>
       <m:oMath>
         <m:r>
@@ -16451,7 +16451,7 @@
             <w:sz w:val="22"/>
             <w:szCs w:val="22"/>
           </w:rPr>
-          <m:t>H=0.354</m:t>
+          <m:t>H=0.353</m:t>
         </m:r>
       </m:oMath>
       <w:r>
@@ -16476,7 +16476,7 @@
           <w:sz w:val="22"/>
           <w:szCs w:val="22"/>
         </w:rPr>
-        <w:t xml:space="preserve">): 0.0869 against 0.0857 kWh.</w:t>
+        <w:t xml:space="preserve">): 0.0870 against 0.0857 kWh.</w:t>
       </w:r>
     </w:p>
     <w:p>
@@ -16625,7 +16625,7 @@
           <w:sz w:val="22"/>
           <w:szCs w:val="22"/>
         </w:rPr>
-        <w:t xml:space="preserve"> 0.0638). The traffic needed to come within 10 % of centralised validation MAE, however, grew from 12.7 MB (4.6 rounds) with random grouping to 19.3 MB at </w:t>
+        <w:t xml:space="preserve"> 0.0744). The traffic needed to come within 10 % of centralised validation MAE, however, grew from 31.4 MB (11.4 rounds) with random grouping to 39.1 MB at </w:t>
       </w:r>
       <m:oMath>
         <m:r>
@@ -16642,7 +16642,7 @@
           <w:sz w:val="22"/>
           <w:szCs w:val="22"/>
         </w:rPr>
-        <w:t xml:space="preserve"> and 18.7 MB under the cluster partition, an increase of about 85 %.</w:t>
+        <w:t xml:space="preserve"> and 34.2 MB under the cluster partition, an increase of about 85 %.</w:t>
       </w:r>
     </w:p>
     <w:p>
@@ -17181,7 +17181,7 @@
                 <w:sz w:val="16"/>
                 <w:szCs w:val="16"/>
               </w:rPr>
-              <w:t xml:space="preserve">+5.6</w:t>
+              <w:t xml:space="preserve">+5.4</w:t>
             </w:r>
           </w:p>
         </w:tc>
@@ -17384,7 +17384,7 @@
                 <w:sz w:val="16"/>
                 <w:szCs w:val="16"/>
               </w:rPr>
-              <w:t xml:space="preserve">+5.6</w:t>
+              <w:t xml:space="preserve">+5.4</w:t>
             </w:r>
           </w:p>
         </w:tc>
@@ -17587,7 +17587,7 @@
                 <w:sz w:val="16"/>
                 <w:szCs w:val="16"/>
               </w:rPr>
-              <w:t xml:space="preserve">+5.9</w:t>
+              <w:t xml:space="preserve">+5.7</w:t>
             </w:r>
           </w:p>
         </w:tc>
@@ -17651,7 +17651,7 @@
                 <w:sz w:val="16"/>
                 <w:szCs w:val="16"/>
               </w:rPr>
-              <w:t xml:space="preserve">FedProx</w:t>
+              <w:t xml:space="preserve">HA-FedProx</w:t>
             </w:r>
           </w:p>
         </w:tc>
@@ -17726,7 +17726,7 @@
                 <w:sz w:val="16"/>
                 <w:szCs w:val="16"/>
               </w:rPr>
-              <w:t xml:space="preserve">0.861</w:t>
+              <w:t xml:space="preserve">0.844</w:t>
             </w:r>
           </w:p>
         </w:tc>
@@ -17751,7 +17751,7 @@
                 <w:sz w:val="16"/>
                 <w:szCs w:val="16"/>
               </w:rPr>
-              <w:t xml:space="preserve">0.0858 </w:t>
+              <w:t xml:space="preserve">0.0863 </w:t>
             </w:r>
             <w:r>
               <w:rPr>
@@ -17765,7 +17765,7 @@
                 <w:sz w:val="16"/>
                 <w:szCs w:val="16"/>
               </w:rPr>
-              <w:t xml:space="preserve"> 0.0001</w:t>
+              <w:t xml:space="preserve"> 0.0003</w:t>
             </w:r>
           </w:p>
         </w:tc>
@@ -17790,7 +17790,7 @@
                 <w:sz w:val="16"/>
                 <w:szCs w:val="16"/>
               </w:rPr>
-              <w:t xml:space="preserve">+5.9</w:t>
+              <w:t xml:space="preserve">+6.3</w:t>
             </w:r>
           </w:p>
         </w:tc>
@@ -17854,7 +17854,7 @@
                 <w:sz w:val="16"/>
                 <w:szCs w:val="16"/>
               </w:rPr>
-              <w:t xml:space="preserve">HA-FedProx</w:t>
+              <w:t xml:space="preserve">FedAvg</w:t>
             </w:r>
           </w:p>
         </w:tc>
@@ -17879,7 +17879,7 @@
                 <w:sz w:val="16"/>
                 <w:szCs w:val="16"/>
               </w:rPr>
-              <w:t xml:space="preserve">0.243</w:t>
+              <w:t xml:space="preserve">0.246</w:t>
             </w:r>
           </w:p>
         </w:tc>
@@ -17904,7 +17904,7 @@
                 <w:sz w:val="16"/>
                 <w:szCs w:val="16"/>
               </w:rPr>
-              <w:t xml:space="preserve">0.0153</w:t>
+              <w:t xml:space="preserve">0.0152</w:t>
             </w:r>
           </w:p>
         </w:tc>
@@ -17929,7 +17929,7 @@
                 <w:sz w:val="16"/>
                 <w:szCs w:val="16"/>
               </w:rPr>
-              <w:t xml:space="preserve">0.844</w:t>
+              <w:t xml:space="preserve">0.871</w:t>
             </w:r>
           </w:p>
         </w:tc>
@@ -17954,7 +17954,7 @@
                 <w:sz w:val="16"/>
                 <w:szCs w:val="16"/>
               </w:rPr>
-              <w:t xml:space="preserve">0.0863 </w:t>
+              <w:t xml:space="preserve">0.0860 </w:t>
             </w:r>
             <w:r>
               <w:rPr>
@@ -17993,7 +17993,7 @@
                 <w:sz w:val="16"/>
                 <w:szCs w:val="16"/>
               </w:rPr>
-              <w:t xml:space="preserve">+6.5</w:t>
+              <w:t xml:space="preserve">+5.9</w:t>
             </w:r>
           </w:p>
         </w:tc>
@@ -18057,7 +18057,7 @@
                 <w:sz w:val="16"/>
                 <w:szCs w:val="16"/>
               </w:rPr>
-              <w:t xml:space="preserve">FedAvg</w:t>
+              <w:t xml:space="preserve">FedProx</w:t>
             </w:r>
           </w:p>
         </w:tc>
@@ -18132,7 +18132,7 @@
                 <w:sz w:val="16"/>
                 <w:szCs w:val="16"/>
               </w:rPr>
-              <w:t xml:space="preserve">0.871</w:t>
+              <w:t xml:space="preserve">0.859</w:t>
             </w:r>
           </w:p>
         </w:tc>
@@ -18157,7 +18157,7 @@
                 <w:sz w:val="16"/>
                 <w:szCs w:val="16"/>
               </w:rPr>
-              <w:t xml:space="preserve">0.0860 </w:t>
+              <w:t xml:space="preserve">0.0857 </w:t>
             </w:r>
             <w:r>
               <w:rPr>
@@ -18171,7 +18171,7 @@
                 <w:sz w:val="16"/>
                 <w:szCs w:val="16"/>
               </w:rPr>
-              <w:t xml:space="preserve"> 0.0003</w:t>
+              <w:t xml:space="preserve"> 0.0002</w:t>
             </w:r>
           </w:p>
         </w:tc>
@@ -18196,7 +18196,7 @@
                 <w:sz w:val="16"/>
                 <w:szCs w:val="16"/>
               </w:rPr>
-              <w:t xml:space="preserve">+6.0</w:t>
+              <w:t xml:space="preserve">+5.6</w:t>
             </w:r>
           </w:p>
         </w:tc>
@@ -18390,7 +18390,7 @@
                 <w:sz w:val="16"/>
                 <w:szCs w:val="16"/>
               </w:rPr>
-              <w:t xml:space="preserve">+5.3</w:t>
+              <w:t xml:space="preserve">+5.2</w:t>
             </w:r>
           </w:p>
         </w:tc>
@@ -18584,7 +18584,7 @@
                 <w:sz w:val="16"/>
                 <w:szCs w:val="16"/>
               </w:rPr>
-              <w:t xml:space="preserve">+5.4</w:t>
+              <w:t xml:space="preserve">+5.3</w:t>
             </w:r>
           </w:p>
         </w:tc>
@@ -18778,7 +18778,7 @@
                 <w:sz w:val="16"/>
                 <w:szCs w:val="16"/>
               </w:rPr>
-              <w:t xml:space="preserve">+6.0</w:t>
+              <w:t xml:space="preserve">+5.8</w:t>
             </w:r>
           </w:p>
         </w:tc>
@@ -18981,7 +18981,7 @@
                 <w:sz w:val="16"/>
                 <w:szCs w:val="16"/>
               </w:rPr>
-              <w:t xml:space="preserve">+5.0</w:t>
+              <w:t xml:space="preserve">+4.8</w:t>
             </w:r>
           </w:p>
         </w:tc>
@@ -19184,7 +19184,7 @@
                 <w:sz w:val="16"/>
                 <w:szCs w:val="16"/>
               </w:rPr>
-              <w:t xml:space="preserve">+5.7</w:t>
+              <w:t xml:space="preserve">+5.6</w:t>
             </w:r>
           </w:p>
         </w:tc>
@@ -19387,7 +19387,7 @@
                 <w:sz w:val="16"/>
                 <w:szCs w:val="16"/>
               </w:rPr>
-              <w:t xml:space="preserve">+5.8</w:t>
+              <w:t xml:space="preserve">+5.6</w:t>
             </w:r>
           </w:p>
         </w:tc>
@@ -19581,7 +19581,7 @@
                 <w:sz w:val="16"/>
                 <w:szCs w:val="16"/>
               </w:rPr>
-              <w:t xml:space="preserve">+5.8</w:t>
+              <w:t xml:space="preserve">+5.6</w:t>
             </w:r>
           </w:p>
         </w:tc>
@@ -19636,7 +19636,7 @@
                 <w:sz w:val="16"/>
                 <w:szCs w:val="16"/>
               </w:rPr>
-              <w:t xml:space="preserve">HA-FedProx</w:t>
+              <w:t xml:space="preserve">FedAvg</w:t>
             </w:r>
           </w:p>
         </w:tc>
@@ -19711,7 +19711,7 @@
                 <w:sz w:val="16"/>
                 <w:szCs w:val="16"/>
               </w:rPr>
-              <w:t xml:space="preserve">0.851</w:t>
+              <w:t xml:space="preserve">0.876</w:t>
             </w:r>
           </w:p>
         </w:tc>
@@ -19736,7 +19736,7 @@
                 <w:sz w:val="16"/>
                 <w:szCs w:val="16"/>
               </w:rPr>
-              <w:t xml:space="preserve">0.0865 </w:t>
+              <w:t xml:space="preserve">0.0857 </w:t>
             </w:r>
             <w:r>
               <w:rPr>
@@ -19750,7 +19750,7 @@
                 <w:sz w:val="16"/>
                 <w:szCs w:val="16"/>
               </w:rPr>
-              <w:t xml:space="preserve"> 0.0002</w:t>
+              <w:t xml:space="preserve"> 0.0003</w:t>
             </w:r>
           </w:p>
         </w:tc>
@@ -19775,7 +19775,7 @@
                 <w:sz w:val="16"/>
                 <w:szCs w:val="16"/>
               </w:rPr>
-              <w:t xml:space="preserve">+6.7</w:t>
+              <w:t xml:space="preserve">+5.5</w:t>
             </w:r>
           </w:p>
         </w:tc>
@@ -19828,7 +19828,7 @@
                 <w:sz w:val="16"/>
                 <w:szCs w:val="16"/>
               </w:rPr>
-              <w:t xml:space="preserve">FedAvg</w:t>
+              <w:t xml:space="preserve">HA-FedProx</w:t>
             </w:r>
           </w:p>
         </w:tc>
@@ -19900,7 +19900,7 @@
                 <w:sz w:val="16"/>
                 <w:szCs w:val="16"/>
               </w:rPr>
-              <w:t xml:space="preserve">0.876</w:t>
+              <w:t xml:space="preserve">0.849</w:t>
             </w:r>
           </w:p>
         </w:tc>
@@ -19924,7 +19924,7 @@
                 <w:sz w:val="16"/>
                 <w:szCs w:val="16"/>
               </w:rPr>
-              <w:t xml:space="preserve">0.0857 </w:t>
+              <w:t xml:space="preserve">0.0862 </w:t>
             </w:r>
             <w:r>
               <w:rPr>
@@ -19938,7 +19938,7 @@
                 <w:sz w:val="16"/>
                 <w:szCs w:val="16"/>
               </w:rPr>
-              <w:t xml:space="preserve"> 0.0003</w:t>
+              <w:t xml:space="preserve"> 0.0004</w:t>
             </w:r>
           </w:p>
         </w:tc>
@@ -19962,7 +19962,7 @@
                 <w:sz w:val="16"/>
                 <w:szCs w:val="16"/>
               </w:rPr>
-              <w:t xml:space="preserve">+5.7</w:t>
+              <w:t xml:space="preserve">+6.2</w:t>
             </w:r>
           </w:p>
         </w:tc>
@@ -20212,7 +20212,7 @@
           <w:sz w:val="22"/>
           <w:szCs w:val="22"/>
         </w:rPr>
-        <w:t xml:space="preserve"> FedProx was better for 69 % of households, but the median paired difference was -0.0001 kWh, about 0.1 % of the error. Under the cluster partition and under partial participation FedProx was slightly worse.</w:t>
+        <w:t xml:space="preserve"> FedProx was better for 79 % of households, but the median paired difference was −0.0002 kWh, about 0.1 % of the error. Under the cluster partition and under partial participation FedProx was slightly worse.</w:t>
       </w:r>
     </w:p>
     <w:p>
@@ -20660,7 +20660,7 @@
                 <w:sz w:val="17"/>
                 <w:szCs w:val="17"/>
               </w:rPr>
-              <w:t xml:space="preserve">34</w:t>
+              <w:t xml:space="preserve">35</w:t>
             </w:r>
           </w:p>
         </w:tc>
@@ -20685,7 +20685,7 @@
                 <w:sz w:val="17"/>
                 <w:szCs w:val="17"/>
               </w:rPr>
-              <w:t xml:space="preserve">0.0005</w:t>
+              <w:t xml:space="preserve">0.0003</w:t>
             </w:r>
           </w:p>
         </w:tc>
@@ -20710,7 +20710,7 @@
                 <w:sz w:val="17"/>
                 <w:szCs w:val="17"/>
               </w:rPr>
-              <w:t xml:space="preserve">0.0047</w:t>
+              <w:t xml:space="preserve">0.0029</w:t>
             </w:r>
           </w:p>
         </w:tc>
@@ -20831,7 +20831,7 @@
                 <w:sz w:val="17"/>
                 <w:szCs w:val="17"/>
               </w:rPr>
-              <w:t xml:space="preserve">0</w:t>
+              <w:t xml:space="preserve">1</w:t>
             </w:r>
           </w:p>
         </w:tc>
@@ -21030,7 +21030,7 @@
                 <w:sz w:val="17"/>
                 <w:szCs w:val="17"/>
               </w:rPr>
-              <w:t xml:space="preserve">0</w:t>
+              <w:t xml:space="preserve">1</w:t>
             </w:r>
           </w:p>
         </w:tc>
@@ -21236,7 +21236,7 @@
                 <w:sz w:val="17"/>
                 <w:szCs w:val="17"/>
               </w:rPr>
-              <w:t xml:space="preserve">−0.0001</w:t>
+              <w:t xml:space="preserve">−0.0002</w:t>
             </w:r>
           </w:p>
         </w:tc>
@@ -21261,7 +21261,7 @@
                 <w:sz w:val="17"/>
                 <w:szCs w:val="17"/>
               </w:rPr>
-              <w:t xml:space="preserve">69</w:t>
+              <w:t xml:space="preserve">79</w:t>
             </w:r>
           </w:p>
         </w:tc>
@@ -21286,7 +21286,29 @@
                 <w:sz w:val="17"/>
                 <w:szCs w:val="17"/>
               </w:rPr>
-              <w:t xml:space="preserve">0.0007</w:t>
+              <w:t xml:space="preserve">&lt;</w:t>
+            </w:r>
+            <w:r>
+              <w:rPr>
+                <w:sz w:val="17"/>
+                <w:szCs w:val="17"/>
+              </w:rPr>
+              <w:t xml:space="preserve">1</w:t>
+            </w:r>
+            <w:r>
+              <w:rPr>
+                <w:sz w:val="17"/>
+                <w:szCs w:val="17"/>
+              </w:rPr>
+              <w:t xml:space="preserve">0</w:t>
+            </w:r>
+            <w:r>
+              <w:rPr>
+                <w:sz w:val="17"/>
+                <w:szCs w:val="17"/>
+                <w:vertAlign w:val="superscript"/>
+              </w:rPr>
+              <w:t xml:space="preserve">−4</w:t>
             </w:r>
           </w:p>
         </w:tc>
@@ -21311,7 +21333,29 @@
                 <w:sz w:val="17"/>
                 <w:szCs w:val="17"/>
               </w:rPr>
-              <w:t xml:space="preserve">0.0061</w:t>
+              <w:t xml:space="preserve">&lt;</w:t>
+            </w:r>
+            <w:r>
+              <w:rPr>
+                <w:sz w:val="17"/>
+                <w:szCs w:val="17"/>
+              </w:rPr>
+              <w:t xml:space="preserve">1</w:t>
+            </w:r>
+            <w:r>
+              <w:rPr>
+                <w:sz w:val="17"/>
+                <w:szCs w:val="17"/>
+              </w:rPr>
+              <w:t xml:space="preserve">0</w:t>
+            </w:r>
+            <w:r>
+              <w:rPr>
+                <w:sz w:val="17"/>
+                <w:szCs w:val="17"/>
+                <w:vertAlign w:val="superscript"/>
+              </w:rPr>
+              <w:t xml:space="preserve">−4</w:t>
             </w:r>
           </w:p>
         </w:tc>
@@ -21466,7 +21510,7 @@
                 <w:sz w:val="17"/>
                 <w:szCs w:val="17"/>
               </w:rPr>
-              <w:t xml:space="preserve">0.0047</w:t>
+              <w:t xml:space="preserve">0.0034</w:t>
             </w:r>
           </w:p>
         </w:tc>
@@ -21996,7 +22040,7 @@
                 <w:sz w:val="17"/>
                 <w:szCs w:val="17"/>
               </w:rPr>
-              <w:t xml:space="preserve">+0.0001</w:t>
+              <w:t xml:space="preserve">+0.0002</w:t>
             </w:r>
           </w:p>
         </w:tc>
@@ -22021,7 +22065,7 @@
                 <w:sz w:val="17"/>
                 <w:szCs w:val="17"/>
               </w:rPr>
-              <w:t xml:space="preserve">43</w:t>
+              <w:t xml:space="preserve">26</w:t>
             </w:r>
           </w:p>
         </w:tc>
@@ -22046,7 +22090,29 @@
                 <w:sz w:val="17"/>
                 <w:szCs w:val="17"/>
               </w:rPr>
-              <w:t xml:space="preserve">0.0031</w:t>
+              <w:t xml:space="preserve">&lt;</w:t>
+            </w:r>
+            <w:r>
+              <w:rPr>
+                <w:sz w:val="17"/>
+                <w:szCs w:val="17"/>
+              </w:rPr>
+              <w:t xml:space="preserve">1</w:t>
+            </w:r>
+            <w:r>
+              <w:rPr>
+                <w:sz w:val="17"/>
+                <w:szCs w:val="17"/>
+              </w:rPr>
+              <w:t xml:space="preserve">0</w:t>
+            </w:r>
+            <w:r>
+              <w:rPr>
+                <w:sz w:val="17"/>
+                <w:szCs w:val="17"/>
+                <w:vertAlign w:val="superscript"/>
+              </w:rPr>
+              <w:t xml:space="preserve">−4</w:t>
             </w:r>
           </w:p>
         </w:tc>
@@ -22071,7 +22137,29 @@
                 <w:sz w:val="17"/>
                 <w:szCs w:val="17"/>
               </w:rPr>
-              <w:t xml:space="preserve">0.0217</w:t>
+              <w:t xml:space="preserve">&lt;</w:t>
+            </w:r>
+            <w:r>
+              <w:rPr>
+                <w:sz w:val="17"/>
+                <w:szCs w:val="17"/>
+              </w:rPr>
+              <w:t xml:space="preserve">1</w:t>
+            </w:r>
+            <w:r>
+              <w:rPr>
+                <w:sz w:val="17"/>
+                <w:szCs w:val="17"/>
+              </w:rPr>
+              <w:t xml:space="preserve">0</w:t>
+            </w:r>
+            <w:r>
+              <w:rPr>
+                <w:sz w:val="17"/>
+                <w:szCs w:val="17"/>
+                <w:vertAlign w:val="superscript"/>
+              </w:rPr>
+              <w:t xml:space="preserve">−4</w:t>
             </w:r>
           </w:p>
         </w:tc>
@@ -22176,7 +22264,7 @@
                 <w:sz w:val="17"/>
                 <w:szCs w:val="17"/>
               </w:rPr>
-              <w:t xml:space="preserve">25</w:t>
+              <w:t xml:space="preserve">27</w:t>
             </w:r>
           </w:p>
         </w:tc>
@@ -22375,7 +22463,7 @@
                 <w:sz w:val="17"/>
                 <w:szCs w:val="17"/>
               </w:rPr>
-              <w:t xml:space="preserve">39</w:t>
+              <w:t xml:space="preserve">42</w:t>
             </w:r>
           </w:p>
         </w:tc>
@@ -22400,7 +22488,7 @@
                 <w:sz w:val="17"/>
                 <w:szCs w:val="17"/>
               </w:rPr>
-              <w:t xml:space="preserve">0.0012</w:t>
+              <w:t xml:space="preserve">0.0210</w:t>
             </w:r>
           </w:p>
         </w:tc>
@@ -22425,7 +22513,7 @@
                 <w:sz w:val="17"/>
                 <w:szCs w:val="17"/>
               </w:rPr>
-              <w:t xml:space="preserve">0.0093</w:t>
+              <w:t xml:space="preserve">0.1263</w:t>
             </w:r>
           </w:p>
         </w:tc>
@@ -22998,7 +23086,7 @@
                 <w:sz w:val="17"/>
                 <w:szCs w:val="17"/>
               </w:rPr>
-              <w:t xml:space="preserve">0.0638</w:t>
+              <w:t xml:space="preserve">0.0744</w:t>
             </w:r>
           </w:p>
         </w:tc>
@@ -23078,7 +23166,7 @@
                 <w:sz w:val="17"/>
                 <w:szCs w:val="17"/>
               </w:rPr>
-              <w:t xml:space="preserve">+0.0027</w:t>
+              <w:t xml:space="preserve">+0.0026</w:t>
             </w:r>
           </w:p>
         </w:tc>
@@ -23277,7 +23365,7 @@
                 <w:sz w:val="17"/>
                 <w:szCs w:val="17"/>
               </w:rPr>
-              <w:t xml:space="preserve">+0.0045</w:t>
+              <w:t xml:space="preserve">+0.0041</w:t>
             </w:r>
           </w:p>
         </w:tc>
@@ -23302,7 +23390,7 @@
                 <w:sz w:val="17"/>
                 <w:szCs w:val="17"/>
               </w:rPr>
-              <w:t xml:space="preserve">0</w:t>
+              <w:t xml:space="preserve">1</w:t>
             </w:r>
           </w:p>
         </w:tc>
@@ -23476,7 +23564,7 @@
                 <w:sz w:val="17"/>
                 <w:szCs w:val="17"/>
               </w:rPr>
-              <w:t xml:space="preserve">+0.0003</w:t>
+              <w:t xml:space="preserve">+0.0004</w:t>
             </w:r>
           </w:p>
         </w:tc>
@@ -23501,7 +23589,7 @@
                 <w:sz w:val="17"/>
                 <w:szCs w:val="17"/>
               </w:rPr>
-              <w:t xml:space="preserve">22</w:t>
+              <w:t xml:space="preserve">13</w:t>
             </w:r>
           </w:p>
         </w:tc>
@@ -23906,7 +23994,7 @@
                 <w:sz w:val="17"/>
                 <w:szCs w:val="17"/>
               </w:rPr>
-              <w:t xml:space="preserve">−0.0016</w:t>
+              <w:t xml:space="preserve">−0.0015</w:t>
             </w:r>
           </w:p>
         </w:tc>
@@ -24003,29 +24091,7 @@
                 <w:sz w:val="17"/>
                 <w:szCs w:val="17"/>
               </w:rPr>
-              <w:t xml:space="preserve">&lt;</w:t>
-            </w:r>
-            <w:r>
-              <w:rPr>
-                <w:sz w:val="17"/>
-                <w:szCs w:val="17"/>
-              </w:rPr>
-              <w:t xml:space="preserve">1</w:t>
-            </w:r>
-            <w:r>
-              <w:rPr>
-                <w:sz w:val="17"/>
-                <w:szCs w:val="17"/>
-              </w:rPr>
-              <w:t xml:space="preserve">0</w:t>
-            </w:r>
-            <w:r>
-              <w:rPr>
-                <w:sz w:val="17"/>
-                <w:szCs w:val="17"/>
-                <w:vertAlign w:val="superscript"/>
-              </w:rPr>
-              <w:t xml:space="preserve">−4</w:t>
+              <w:t xml:space="preserve">0.0002</w:t>
             </w:r>
           </w:p>
         </w:tc>
@@ -24105,7 +24171,7 @@
                 <w:sz w:val="17"/>
                 <w:szCs w:val="17"/>
               </w:rPr>
-              <w:t xml:space="preserve">−0.0000</w:t>
+              <w:t xml:space="preserve">+0.0000</w:t>
             </w:r>
           </w:p>
         </w:tc>
@@ -24130,7 +24196,7 @@
                 <w:sz w:val="17"/>
                 <w:szCs w:val="17"/>
               </w:rPr>
-              <w:t xml:space="preserve">52</w:t>
+              <w:t xml:space="preserve">49</w:t>
             </w:r>
           </w:p>
         </w:tc>
@@ -24155,7 +24221,7 @@
                 <w:sz w:val="17"/>
                 <w:szCs w:val="17"/>
               </w:rPr>
-              <w:t xml:space="preserve">0.1046</w:t>
+              <w:t xml:space="preserve">0.3322</w:t>
             </w:r>
           </w:p>
         </w:tc>
@@ -24180,7 +24246,7 @@
                 <w:sz w:val="17"/>
                 <w:szCs w:val="17"/>
               </w:rPr>
-              <w:t xml:space="preserve">0.2092</w:t>
+              <w:t xml:space="preserve">0.6645</w:t>
             </w:r>
           </w:p>
         </w:tc>
@@ -24260,7 +24326,7 @@
                 <w:sz w:val="17"/>
                 <w:szCs w:val="17"/>
               </w:rPr>
-              <w:t xml:space="preserve">+0.0023</w:t>
+              <w:t xml:space="preserve">+0.0022</w:t>
             </w:r>
           </w:p>
         </w:tc>
@@ -24285,7 +24351,7 @@
                 <w:sz w:val="17"/>
                 <w:szCs w:val="17"/>
               </w:rPr>
-              <w:t xml:space="preserve">1</w:t>
+              <w:t xml:space="preserve">2</w:t>
             </w:r>
           </w:p>
         </w:tc>
@@ -24475,7 +24541,7 @@
                 <w:sz w:val="17"/>
                 <w:szCs w:val="17"/>
               </w:rPr>
-              <w:t xml:space="preserve">−0.0001</w:t>
+              <w:t xml:space="preserve">−0.0000</w:t>
             </w:r>
           </w:p>
         </w:tc>
@@ -24500,7 +24566,7 @@
                 <w:sz w:val="17"/>
                 <w:szCs w:val="17"/>
               </w:rPr>
-              <w:t xml:space="preserve">51</w:t>
+              <w:t xml:space="preserve">50</w:t>
             </w:r>
           </w:p>
         </w:tc>
@@ -24525,7 +24591,7 @@
                 <w:sz w:val="17"/>
                 <w:szCs w:val="17"/>
               </w:rPr>
-              <w:t xml:space="preserve">0.4960</w:t>
+              <w:t xml:space="preserve">0.5158</w:t>
             </w:r>
           </w:p>
         </w:tc>
@@ -24550,7 +24616,7 @@
                 <w:sz w:val="17"/>
                 <w:szCs w:val="17"/>
               </w:rPr>
-              <w:t xml:space="preserve">0.4960</w:t>
+              <w:t xml:space="preserve">0.6645</w:t>
             </w:r>
           </w:p>
         </w:tc>
@@ -24646,7 +24712,7 @@
                 <w:sz w:val="17"/>
                 <w:szCs w:val="17"/>
               </w:rPr>
-              <w:t xml:space="preserve">+0.0013</w:t>
+              <w:t xml:space="preserve">+0.0014</w:t>
             </w:r>
           </w:p>
         </w:tc>
@@ -24671,7 +24737,7 @@
                 <w:sz w:val="17"/>
                 <w:szCs w:val="17"/>
               </w:rPr>
-              <w:t xml:space="preserve">26</w:t>
+              <w:t xml:space="preserve">27</w:t>
             </w:r>
           </w:p>
         </w:tc>
@@ -24842,7 +24908,7 @@
                 <w:sz w:val="17"/>
                 <w:szCs w:val="17"/>
               </w:rPr>
-              <w:t xml:space="preserve">+0.0006</w:t>
+              <w:t xml:space="preserve">+0.0004</w:t>
             </w:r>
           </w:p>
         </w:tc>
@@ -24866,7 +24932,7 @@
                 <w:sz w:val="17"/>
                 <w:szCs w:val="17"/>
               </w:rPr>
-              <w:t xml:space="preserve">39</w:t>
+              <w:t xml:space="preserve">41</w:t>
             </w:r>
           </w:p>
         </w:tc>
@@ -24890,7 +24956,7 @@
                 <w:sz w:val="17"/>
                 <w:szCs w:val="17"/>
               </w:rPr>
-              <w:t xml:space="preserve">0.0142</w:t>
+              <w:t xml:space="preserve">0.0283</w:t>
             </w:r>
           </w:p>
         </w:tc>
@@ -24914,7 +24980,7 @@
                 <w:sz w:val="17"/>
                 <w:szCs w:val="17"/>
               </w:rPr>
-              <w:t xml:space="preserve">0.0711</w:t>
+              <w:t xml:space="preserve">0.1413</w:t>
             </w:r>
           </w:p>
         </w:tc>
@@ -24935,7 +25001,7 @@
           <w:sz w:val="22"/>
           <w:szCs w:val="22"/>
         </w:rPr>
-        <w:t xml:space="preserve">HA-FedProx never improved on FedAvg. Under the cluster partition it was worse for 75 % of households (median +0.0003 kWh, </w:t>
+        <w:t xml:space="preserve">HA-FedProx never improved on FedAvg. Under the cluster partition it was worse for 73 % of households (median +0.0003 kWh, </w:t>
       </w:r>
       <m:oMath>
         <m:sSub>
@@ -25026,7 +25092,7 @@
           <w:sz w:val="22"/>
           <w:szCs w:val="22"/>
         </w:rPr>
-        <w:t xml:space="preserve"> band (35.8 MB against 12.7 MB for FedAvg). Fig. 5 shows the update-disagreement ratio. It started low (0.15 on average in round 1), rose quickly and settled near 0.96. Across the full-participation runs with </w:t>
+        <w:t xml:space="preserve"> band (59.7 MB against 31.4 MB for FedAvg). Fig. 5 shows the update-disagreement ratio. It started low (0.15 on average in round 1), rose quickly and settled near 0.96. Across the full-participation runs with </w:t>
       </w:r>
       <m:oMath>
         <m:r>
@@ -25359,7 +25425,7 @@
           <w:sz w:val="22"/>
           <w:szCs w:val="22"/>
         </w:rPr>
-        <w:t xml:space="preserve"> band after 6.7 MB and ended at 0.0850 kWh, no worse than full participation, using 37.2 MB in total. Sending updates as 16-bit floats halved the traffic (41.3 MB in total, 10.2 MB to the </w:t>
+        <w:t xml:space="preserve"> band after 21.9 MB and ended at 0.0850 kWh, no worse than full participation, using 37.2 MB in total. Sending updates as 16-bit floats halved the traffic (41.3 MB in total, 16.3 MB to the </w:t>
       </w:r>
       <m:oMath>
         <m:r>
@@ -25376,7 +25442,7 @@
           <w:sz w:val="22"/>
           <w:szCs w:val="22"/>
         </w:rPr>
-        <w:t xml:space="preserve"> band) without harming accuracy: 0.0857 kWh against 0.0860 kWh at 32 bits, and marginally better for 92 % of households (median -0.0001 kWh).</w:t>
+        <w:t xml:space="preserve"> band) without harming accuracy: 0.0857 kWh against 0.0860 kWh at 32 bits, and marginally better for 92 % of households (median −0.0001 kWh).</w:t>
       </w:r>
     </w:p>
     <w:p>
@@ -25406,7 +25472,7 @@
           <w:sz w:val="22"/>
           <w:szCs w:val="22"/>
         </w:rPr>
-        <w:t xml:space="preserve"> band within 30 rounds, after 28.5 rounds and 392.5 MB on average; none of the HA-FedProx household runs did. Validation error did not decrease monotonically with traffic: all federated variants passed through a transient rise in rounds 5–8 before converging, coinciding with the dip in </w:t>
+        <w:t xml:space="preserve"> band within 30 rounds, after 30.0 rounds and 413.2 MB on average; none of the HA-FedProx household runs did. Validation error did not decrease monotonically with traffic: all federated variants passed through a transient rise in rounds 5–8 before converging, coinciding with the dip in </w:t>
       </w:r>
       <m:oMath>
         <m:sSub>
@@ -25538,7 +25604,7 @@
           <w:sz w:val="22"/>
           <w:szCs w:val="22"/>
         </w:rPr>
-        <w:t xml:space="preserve">Table 8 and Fig. 7 give the per-household view. Centralised training left 28 % of households worse off than training alone. FedAvg left 56 % (random grouping) to 66 % (</w:t>
+        <w:t xml:space="preserve">Table 8 and Fig. 7 give the per-household view. Centralised training left 28 % of households worse off than training alone. FedAvg left 61 % (random grouping) to 65 % (</w:t>
       </w:r>
       <m:oMath>
         <m:r>
@@ -25555,7 +25621,7 @@
           <w:sz w:val="22"/>
           <w:szCs w:val="22"/>
         </w:rPr>
-        <w:t xml:space="preserve">) worse off, and one epoch of local fine-tuning reduced this to 51–49 %. After fine-tuning, FedAvg was statistically indistinguishable from local training per household (51 % better, </w:t>
+        <w:t xml:space="preserve">) worse off, and one epoch of local fine-tuning reduced this to 50–50 %. After fine-tuning, FedAvg was statistically indistinguishable from local training per household (50 % better, </w:t>
       </w:r>
       <m:oMath>
         <m:sSub>
@@ -25589,7 +25655,7 @@
           <w:sz w:val="22"/>
           <w:szCs w:val="22"/>
         </w:rPr>
-        <w:t xml:space="preserve"> 0.4960), improved pooled MAE to 0.0833 kWh, and remained behind centralised training (26 % of households better). With household clients FedAvg was worse than local training for 82 % of households (</w:t>
+        <w:t xml:space="preserve"> 0.6645), improved pooled MAE to 0.0833 kWh, and remained behind centralised training (27 % of households better). With household clients FedAvg was worse than local training for 82 % of households (</w:t>
       </w:r>
       <m:oMath>
         <m:sSub>
@@ -25663,7 +25729,7 @@
           <w:sz w:val="22"/>
           <w:szCs w:val="22"/>
         </w:rPr>
-        <w:t xml:space="preserve">), and its 90th-percentile household error rose to 0.1513 kWh against 0.1441 kWh for local training. Fine-tuning reduced the share harmed to 61 % and the pooled MAE to 0.0851 kWh, still not better than local training (39 % of households better, </w:t>
+        <w:t xml:space="preserve">), and its 90th-percentile household error rose to 0.1501 kWh against 0.1434 kWh for local training. Fine-tuning reduced the share harmed to 59 % and the pooled MAE to 0.0849 kWh, still not better than local training (41 % of households better, </w:t>
       </w:r>
       <m:oMath>
         <m:sSub>
@@ -25697,7 +25763,7 @@
           <w:sz w:val="22"/>
           <w:szCs w:val="22"/>
         </w:rPr>
-        <w:t xml:space="preserve"> 0.0711). By consumption quintile, the advantage of pooling raw data was concentrated in the highest-consuming homes, and in the top quintile the median household error of FedAvg was above that of local training.</w:t>
+        <w:t xml:space="preserve"> 0.1413). By consumption quintile, the advantage of pooling raw data was concentrated in the highest-consuming homes, and in the top quintile the median household error of FedAvg was above that of local training.</w:t>
       </w:r>
     </w:p>
     <w:p>
@@ -25985,7 +26051,7 @@
                 <w:sz w:val="17"/>
                 <w:szCs w:val="17"/>
               </w:rPr>
-              <w:t xml:space="preserve">+0.0016</w:t>
+              <w:t xml:space="preserve">+0.0015</w:t>
             </w:r>
           </w:p>
         </w:tc>
@@ -26010,7 +26076,7 @@
                 <w:sz w:val="17"/>
                 <w:szCs w:val="17"/>
               </w:rPr>
-              <w:t xml:space="preserve">0.1364</w:t>
+              <w:t xml:space="preserve">0.1362</w:t>
             </w:r>
           </w:p>
         </w:tc>
@@ -26090,7 +26156,7 @@
                 <w:sz w:val="17"/>
                 <w:szCs w:val="17"/>
               </w:rPr>
-              <w:t xml:space="preserve">56</w:t>
+              <w:t xml:space="preserve">61</w:t>
             </w:r>
           </w:p>
         </w:tc>
@@ -26115,7 +26181,7 @@
                 <w:sz w:val="17"/>
                 <w:szCs w:val="17"/>
               </w:rPr>
-              <w:t xml:space="preserve">−0.0007</w:t>
+              <w:t xml:space="preserve">−0.0008</w:t>
             </w:r>
           </w:p>
         </w:tc>
@@ -26165,7 +26231,7 @@
                 <w:sz w:val="17"/>
                 <w:szCs w:val="17"/>
               </w:rPr>
-              <w:t xml:space="preserve">51</w:t>
+              <w:t xml:space="preserve">50</w:t>
             </w:r>
           </w:p>
         </w:tc>
@@ -26236,7 +26302,7 @@
                 <w:sz w:val="17"/>
                 <w:szCs w:val="17"/>
               </w:rPr>
-              <w:t xml:space="preserve">66</w:t>
+              <w:t xml:space="preserve">65</w:t>
             </w:r>
           </w:p>
         </w:tc>
@@ -26311,7 +26377,7 @@
                 <w:sz w:val="17"/>
                 <w:szCs w:val="17"/>
               </w:rPr>
-              <w:t xml:space="preserve">49</w:t>
+              <w:t xml:space="preserve">50</w:t>
             </w:r>
           </w:p>
         </w:tc>
@@ -26366,7 +26432,7 @@
                 <w:sz w:val="17"/>
                 <w:szCs w:val="17"/>
               </w:rPr>
-              <w:t xml:space="preserve">60</w:t>
+              <w:t xml:space="preserve">63</w:t>
             </w:r>
           </w:p>
         </w:tc>
@@ -26441,7 +26507,7 @@
                 <w:sz w:val="17"/>
                 <w:szCs w:val="17"/>
               </w:rPr>
-              <w:t xml:space="preserve">46</w:t>
+              <w:t xml:space="preserve">48</w:t>
             </w:r>
           </w:p>
         </w:tc>
@@ -26512,7 +26578,7 @@
                 <w:sz w:val="17"/>
                 <w:szCs w:val="17"/>
               </w:rPr>
-              <w:t xml:space="preserve">66</w:t>
+              <w:t xml:space="preserve">67</w:t>
             </w:r>
           </w:p>
         </w:tc>
@@ -26667,7 +26733,7 @@
                 <w:sz w:val="17"/>
                 <w:szCs w:val="17"/>
               </w:rPr>
-              <w:t xml:space="preserve">−0.0027</w:t>
+              <w:t xml:space="preserve">−0.0026</w:t>
             </w:r>
           </w:p>
         </w:tc>
@@ -26692,7 +26758,7 @@
                 <w:sz w:val="17"/>
                 <w:szCs w:val="17"/>
               </w:rPr>
-              <w:t xml:space="preserve">0.1514</w:t>
+              <w:t xml:space="preserve">0.1494</w:t>
             </w:r>
           </w:p>
         </w:tc>
@@ -26717,7 +26783,7 @@
                 <w:sz w:val="17"/>
                 <w:szCs w:val="17"/>
               </w:rPr>
-              <w:t xml:space="preserve">61</w:t>
+              <w:t xml:space="preserve">59</w:t>
             </w:r>
           </w:p>
         </w:tc>
@@ -26770,7 +26836,7 @@
                 <w:sz w:val="17"/>
                 <w:szCs w:val="17"/>
               </w:rPr>
-              <w:t xml:space="preserve">85</w:t>
+              <w:t xml:space="preserve">84</w:t>
             </w:r>
           </w:p>
         </w:tc>
@@ -26794,7 +26860,7 @@
                 <w:sz w:val="17"/>
                 <w:szCs w:val="17"/>
               </w:rPr>
-              <w:t xml:space="preserve">−0.0028</w:t>
+              <w:t xml:space="preserve">−0.0030</w:t>
             </w:r>
           </w:p>
         </w:tc>
@@ -26842,7 +26908,7 @@
                 <w:sz w:val="17"/>
                 <w:szCs w:val="17"/>
               </w:rPr>
-              <w:t xml:space="preserve">67</w:t>
+              <w:t xml:space="preserve">65</w:t>
             </w:r>
           </w:p>
         </w:tc>
@@ -27221,7 +27287,7 @@
           <w:sz w:val="22"/>
           <w:szCs w:val="22"/>
         </w:rPr>
-        <w:t xml:space="preserve"> here) cost 2.0 % in MAE relative to centralised training with 20.7 MB of traffic, whereas meter-level federation lost 10.3 % and moved about 30 times the raw data. Eight months of half-hourly training readings from one household occupy about 140 kB, roughly twice a single message of this small LSTM, so at this scale federation is a governance choice based on data minimisation, consent and regulation, not a bandwidth saving. Distribution system operators, suppliers and aggregators adopting federated forecasts should fine-tune the global model locally, which costs no communication and cut the share of harmed homes from about two thirds to under one half; choose the round on validation error, because validation error rose transiently in every federated configuration; and evaluate errors per consumption tier, because the largest consumers, whose forecasts matter most for congestion management, gained most from pooling and were served worst by FedAvg.</w:t>
+        <w:t xml:space="preserve"> here) cost 1.8 % in MAE relative to centralised training with 20.7 MB of traffic, whereas meter-level federation lost 10.0 % and moved about 30 times the raw data. Eight months of half-hourly training readings from one household occupy about 140 kB, roughly twice a single message of this small LSTM, so at this scale federation is a governance choice based on data minimisation, consent and regulation, not a bandwidth saving. Distribution system operators, suppliers and aggregators adopting federated forecasts should fine-tune the global model locally, which costs no communication and cut the share of harmed homes from about two thirds to under one half; choose the round on validation error, because validation error rose transiently in every federated configuration; and evaluate errors per consumption tier, because the largest consumers, whose forecasts matter most for congestion management, gained most from pooling and were served worst by FedAvg.</w:t>
       </w:r>
     </w:p>
     <w:p>
@@ -27264,7 +27330,7 @@
           <w:sz w:val="22"/>
           <w:szCs w:val="22"/>
         </w:rPr>
-        <w:t xml:space="preserve">This study held the households, test set, model and training budget fixed and changed one factor at a time to find where the costs of federated household load forecasting come from, using 100 Low Carbon London homes. The federated protocol on a single client matched centralised accuracy, and the error grew with the number of clients the same homes were spread over, to 10.3 % when every home was its own client. Regrouping homes from random to fully profile-clustered barely changed final accuracy but raised the traffic needed to approach centralised accuracy by about 85 %, and federated training moved more bytes than the readings it kept local. Local fine-tuning removed most of the harm to individual households at community scale; proximal regularisation, fixed or adaptive, brought no benefit. The work shows that the federated accuracy gap is a fragmentation cost, that heterogeneity is mainly a communication cost, and that the case for federation in residential forecasting rests on governance rather than bandwidth. Future work will test these conclusions on other datasets, climates, horizons and larger models, add differential privacy and secure aggregation, and design heterogeneity signals that do not depend on the stage of training.</w:t>
+        <w:t xml:space="preserve">This study held the households, test set, model and training budget fixed and changed one factor at a time to find where the costs of federated household load forecasting come from, using 100 Low Carbon London homes. The federated protocol on a single client matched centralised accuracy, and the error grew with the number of clients the same homes were spread over, to 10.0 % when every home was its own client. Regrouping homes from random to fully profile-clustered barely changed final accuracy but raised the traffic needed to approach centralised accuracy by about 85 %, and federated training moved more bytes than the readings it kept local. Local fine-tuning removed most of the harm to individual households at community scale; proximal regularisation, fixed or adaptive, brought no benefit. The work shows that the federated accuracy gap is a fragmentation cost, that heterogeneity is mainly a communication cost, and that the case for federation in residential forecasting rests on governance rather than bandwidth. Future work will test these conclusions on other datasets, climates, horizons and larger models, add differential privacy and secure aggregation, and design heterogeneity signals that do not depend on the stage of training.</w:t>
       </w:r>
     </w:p>
     <w:p>

</xml_diff>